<commit_message>
tenn answering-brief: caption columns at 3 and 3.4 in, INPUT paragraphs and headings rejoined from the filed layout; docx 1471/1471, latex reported (an em dash, slashes inside words) (fb-595.54.54)
Co-Authored-By: Claude Opus 5.5 <noreply@anthropic.com>
</commit_message>
<xml_diff>
--- a/courts/sixth-circuit/tennessee/state/supreme-court/answering-brief/usage/OUTPUT-answering-brief.docx
+++ b/courts/sixth-circuit/tennessee/state/supreme-court/answering-brief/usage/OUTPUT-answering-brief.docx
@@ -76,8 +76,8 @@
         <w:tblLook w:val="0000" w:firstRow="0" w:lastRow="0" w:firstColumn="0" w:lastColumn="0" w:noHBand="0" w:noVBand="0"/>
       </w:tblPr>
       <w:tblGrid>
-        <w:gridCol w:w="4608"/>
-        <w:gridCol w:w="4752"/>
+        <w:gridCol w:w="4320"/>
+        <w:gridCol w:w="5040"/>
       </w:tblGrid>
       <w:tr>
         <w:trPr>
@@ -85,7 +85,7 @@
         </w:trPr>
         <w:tc>
           <w:tcPr>
-            <w:tcW w:w="4608" w:type="dxa"/>
+            <w:tcW w:w="4320" w:type="dxa"/>
           </w:tcPr>
           <w:p>
             <w:pPr>
@@ -176,7 +176,7 @@
         </w:tc>
         <w:tc>
           <w:tcPr>
-            <w:tcW w:w="4752" w:type="dxa"/>
+            <w:tcW w:w="5040" w:type="dxa"/>
             <w:tcMar>
               <w:left w:w="144" w:type="dxa"/>
             </w:tcMar>
@@ -760,7 +760,7 @@
         <w:tab/>
       </w:r>
       <w:r>
-        <w:t xml:space="preserve">3</w:t>
+        <w:t xml:space="preserve">4</w:t>
       </w:r>
     </w:p>
     <w:p>
@@ -840,7 +840,7 @@
         <w:tab/>
       </w:r>
       <w:r>
-        <w:t xml:space="preserve">6</w:t>
+        <w:t xml:space="preserve">7</w:t>
       </w:r>
     </w:p>
     <w:p>
@@ -862,7 +862,7 @@
         <w:tab/>
       </w:r>
       <w:r>
-        <w:t xml:space="preserve">9</w:t>
+        <w:t xml:space="preserve">10</w:t>
       </w:r>
     </w:p>
     <w:p>
@@ -920,13 +920,121 @@
         <w:t xml:space="preserve">Violate</w:t>
       </w:r>
       <w:r>
+        <w:t xml:space="preserve"> </w:t>
+      </w:r>
+      <w:r>
+        <w:t xml:space="preserve">Appellants’</w:t>
+      </w:r>
+      <w:r>
+        <w:t xml:space="preserve"> </w:t>
+      </w:r>
+      <w:r>
+        <w:t xml:space="preserve">Rights</w:t>
+      </w:r>
+      <w:r>
+        <w:t xml:space="preserve"> </w:t>
+      </w:r>
+      <w:r>
+        <w:t xml:space="preserve">Under</w:t>
+      </w:r>
+      <w:r>
+        <w:t xml:space="preserve"> </w:t>
+      </w:r>
+      <w:r>
+        <w:t xml:space="preserve">the</w:t>
+      </w:r>
+      <w:r>
+        <w:t xml:space="preserve"> </w:t>
+      </w:r>
+      <w:r>
+        <w:t xml:space="preserve">Eighth</w:t>
+      </w:r>
+      <w:r>
+        <w:t xml:space="preserve"> </w:t>
+      </w:r>
+      <w:r>
+        <w:t xml:space="preserve">Amendment</w:t>
+      </w:r>
+      <w:r>
+        <w:t xml:space="preserve"> </w:t>
+      </w:r>
+      <w:r>
+        <w:t xml:space="preserve">to</w:t>
+      </w:r>
+      <w:r>
+        <w:t xml:space="preserve"> </w:t>
+      </w:r>
+      <w:r>
+        <w:t xml:space="preserve">the</w:t>
+      </w:r>
+      <w:r>
+        <w:t xml:space="preserve"> </w:t>
+      </w:r>
+      <w:r>
+        <w:t xml:space="preserve">United</w:t>
+      </w:r>
+      <w:r>
+        <w:t xml:space="preserve"> </w:t>
+      </w:r>
+      <w:r>
+        <w:t xml:space="preserve">States</w:t>
+      </w:r>
+      <w:r>
+        <w:t xml:space="preserve"> </w:t>
+      </w:r>
+      <w:r>
+        <w:t xml:space="preserve">Constitution</w:t>
+      </w:r>
+      <w:r>
+        <w:t xml:space="preserve"> </w:t>
+      </w:r>
+      <w:r>
+        <w:t xml:space="preserve">or</w:t>
+      </w:r>
+      <w:r>
+        <w:t xml:space="preserve"> </w:t>
+      </w:r>
+      <w:r>
+        <w:t xml:space="preserve">Article</w:t>
+      </w:r>
+      <w:r>
+        <w:t xml:space="preserve"> </w:t>
+      </w:r>
+      <w:r>
+        <w:t xml:space="preserve">1,</w:t>
+      </w:r>
+      <w:r>
+        <w:t xml:space="preserve"> </w:t>
+      </w:r>
+      <w:r>
+        <w:t xml:space="preserve">Section</w:t>
+      </w:r>
+      <w:r>
+        <w:t xml:space="preserve"> </w:t>
+      </w:r>
+      <w:r>
+        <w:t xml:space="preserve">16</w:t>
+      </w:r>
+      <w:r>
+        <w:t xml:space="preserve"> </w:t>
+      </w:r>
+      <w:r>
+        <w:t xml:space="preserve">of</w:t>
+      </w:r>
+      <w:r>
+        <w:t xml:space="preserve"> </w:t>
+      </w:r>
+      <w:r>
+        <w:t xml:space="preserve">the</w:t>
+      </w:r>
+      <w:r>
         <w:t xml:space="preserve">   </w:t>
       </w:r>
       <w:r>
         <w:tab/>
       </w:r>
       <w:r>
-        <w:t xml:space="preserve">9</w:t>
+        <w:t xml:space="preserve">10</w:t>
       </w:r>
     </w:p>
     <w:p>
@@ -1324,6 +1432,42 @@
         <w:t xml:space="preserve">in</w:t>
       </w:r>
       <w:r>
+        <w:t xml:space="preserve"> </w:t>
+      </w:r>
+      <w:r>
+        <w:t xml:space="preserve">Denying</w:t>
+      </w:r>
+      <w:r>
+        <w:t xml:space="preserve"> </w:t>
+      </w:r>
+      <w:r>
+        <w:t xml:space="preserve">Appellants’</w:t>
+      </w:r>
+      <w:r>
+        <w:t xml:space="preserve"> </w:t>
+      </w:r>
+      <w:r>
+        <w:t xml:space="preserve">Eleventh-Hour</w:t>
+      </w:r>
+      <w:r>
+        <w:t xml:space="preserve"> </w:t>
+      </w:r>
+      <w:r>
+        <w:t xml:space="preserve">Request</w:t>
+      </w:r>
+      <w:r>
+        <w:t xml:space="preserve"> </w:t>
+      </w:r>
+      <w:r>
+        <w:t xml:space="preserve">to</w:t>
+      </w:r>
+      <w:r>
+        <w:t xml:space="preserve"> </w:t>
+      </w:r>
+      <w:r>
+        <w:t xml:space="preserve">Amend</w:t>
+      </w:r>
+      <w:r>
         <w:t xml:space="preserve">   </w:t>
       </w:r>
       <w:r>
@@ -1400,6 +1544,36 @@
         <w:t xml:space="preserve">in</w:t>
       </w:r>
       <w:r>
+        <w:t xml:space="preserve"> </w:t>
+      </w:r>
+      <w:r>
+        <w:t xml:space="preserve">Denying</w:t>
+      </w:r>
+      <w:r>
+        <w:t xml:space="preserve"> </w:t>
+      </w:r>
+      <w:r>
+        <w:t xml:space="preserve">Appellants’</w:t>
+      </w:r>
+      <w:r>
+        <w:t xml:space="preserve"> </w:t>
+      </w:r>
+      <w:r>
+        <w:t xml:space="preserve">Request</w:t>
+      </w:r>
+      <w:r>
+        <w:t xml:space="preserve"> </w:t>
+      </w:r>
+      <w:r>
+        <w:t xml:space="preserve">for</w:t>
+      </w:r>
+      <w:r>
+        <w:t xml:space="preserve"> </w:t>
+      </w:r>
+      <w:r>
+        <w:t xml:space="preserve">Discovery.</w:t>
+      </w:r>
+      <w:r>
         <w:t xml:space="preserve">   </w:t>
       </w:r>
       <w:r>
@@ -1458,6 +1632,108 @@
         <w:t xml:space="preserve">Identities</w:t>
       </w:r>
       <w:r>
+        <w:t xml:space="preserve"> </w:t>
+      </w:r>
+      <w:r>
+        <w:t xml:space="preserve">of</w:t>
+      </w:r>
+      <w:r>
+        <w:t xml:space="preserve"> </w:t>
+      </w:r>
+      <w:r>
+        <w:t xml:space="preserve">Individuals</w:t>
+      </w:r>
+      <w:r>
+        <w:t xml:space="preserve"> </w:t>
+      </w:r>
+      <w:r>
+        <w:t xml:space="preserve">Involved</w:t>
+      </w:r>
+      <w:r>
+        <w:t xml:space="preserve"> </w:t>
+      </w:r>
+      <w:r>
+        <w:t xml:space="preserve">in</w:t>
+      </w:r>
+      <w:r>
+        <w:t xml:space="preserve"> </w:t>
+      </w:r>
+      <w:r>
+        <w:t xml:space="preserve">the</w:t>
+      </w:r>
+      <w:r>
+        <w:t xml:space="preserve"> </w:t>
+      </w:r>
+      <w:r>
+        <w:t xml:space="preserve">Execution</w:t>
+      </w:r>
+      <w:r>
+        <w:t xml:space="preserve"> </w:t>
+      </w:r>
+      <w:r>
+        <w:t xml:space="preserve">Process</w:t>
+      </w:r>
+      <w:r>
+        <w:t xml:space="preserve"> </w:t>
+      </w:r>
+      <w:r>
+        <w:t xml:space="preserve">Do</w:t>
+      </w:r>
+      <w:r>
+        <w:t xml:space="preserve"> </w:t>
+      </w:r>
+      <w:r>
+        <w:t xml:space="preserve">Not</w:t>
+      </w:r>
+      <w:r>
+        <w:t xml:space="preserve"> </w:t>
+      </w:r>
+      <w:r>
+        <w:t xml:space="preserve">Excuse</w:t>
+      </w:r>
+      <w:r>
+        <w:t xml:space="preserve"> </w:t>
+      </w:r>
+      <w:r>
+        <w:t xml:space="preserve">Appellants</w:t>
+      </w:r>
+      <w:r>
+        <w:t xml:space="preserve"> </w:t>
+      </w:r>
+      <w:r>
+        <w:t xml:space="preserve">from</w:t>
+      </w:r>
+      <w:r>
+        <w:t xml:space="preserve"> </w:t>
+      </w:r>
+      <w:r>
+        <w:t xml:space="preserve">Proving</w:t>
+      </w:r>
+      <w:r>
+        <w:t xml:space="preserve"> </w:t>
+      </w:r>
+      <w:r>
+        <w:t xml:space="preserve">the</w:t>
+      </w:r>
+      <w:r>
+        <w:t xml:space="preserve"> </w:t>
+      </w:r>
+      <w:r>
+        <w:t xml:space="preserve">Essential</w:t>
+      </w:r>
+      <w:r>
+        <w:t xml:space="preserve"> </w:t>
+      </w:r>
+      <w:r>
+        <w:t xml:space="preserve">Elements</w:t>
+      </w:r>
+      <w:r>
+        <w:t xml:space="preserve"> </w:t>
+      </w:r>
+      <w:r>
+        <w:t xml:space="preserve">of</w:t>
+      </w:r>
+      <w:r>
         <w:t xml:space="preserve">   </w:t>
       </w:r>
       <w:r>
@@ -1598,6 +1874,48 @@
         <w:t xml:space="preserve">Appellants’</w:t>
       </w:r>
       <w:r>
+        <w:t xml:space="preserve"> </w:t>
+      </w:r>
+      <w:r>
+        <w:t xml:space="preserve">Constitutional</w:t>
+      </w:r>
+      <w:r>
+        <w:t xml:space="preserve"> </w:t>
+      </w:r>
+      <w:r>
+        <w:t xml:space="preserve">Rights</w:t>
+      </w:r>
+      <w:r>
+        <w:t xml:space="preserve"> </w:t>
+      </w:r>
+      <w:r>
+        <w:t xml:space="preserve">by</w:t>
+      </w:r>
+      <w:r>
+        <w:t xml:space="preserve"> </w:t>
+      </w:r>
+      <w:r>
+        <w:t xml:space="preserve">Using</w:t>
+      </w:r>
+      <w:r>
+        <w:t xml:space="preserve"> </w:t>
+      </w:r>
+      <w:r>
+        <w:t xml:space="preserve">Chemicals</w:t>
+      </w:r>
+      <w:r>
+        <w:t xml:space="preserve"> </w:t>
+      </w:r>
+      <w:r>
+        <w:t xml:space="preserve">Prohibited</w:t>
+      </w:r>
+      <w:r>
+        <w:t xml:space="preserve"> </w:t>
+      </w:r>
+      <w:r>
+        <w:t xml:space="preserve">for</w:t>
+      </w:r>
+      <w:r>
         <w:t xml:space="preserve">   </w:t>
       </w:r>
       <w:r>
@@ -1674,6 +1992,138 @@
         <w:t xml:space="preserve">in</w:t>
       </w:r>
       <w:r>
+        <w:t xml:space="preserve"> </w:t>
+      </w:r>
+      <w:r>
+        <w:t xml:space="preserve">Denying</w:t>
+      </w:r>
+      <w:r>
+        <w:t xml:space="preserve"> </w:t>
+      </w:r>
+      <w:r>
+        <w:t xml:space="preserve">Appellants’</w:t>
+      </w:r>
+      <w:r>
+        <w:t xml:space="preserve"> </w:t>
+      </w:r>
+      <w:r>
+        <w:t xml:space="preserve">Eleventh-Hour</w:t>
+      </w:r>
+      <w:r>
+        <w:t xml:space="preserve"> </w:t>
+      </w:r>
+      <w:r>
+        <w:t xml:space="preserve">Request</w:t>
+      </w:r>
+      <w:r>
+        <w:t xml:space="preserve"> </w:t>
+      </w:r>
+      <w:r>
+        <w:t xml:space="preserve">to</w:t>
+      </w:r>
+      <w:r>
+        <w:t xml:space="preserve"> </w:t>
+      </w:r>
+      <w:r>
+        <w:t xml:space="preserve">Add</w:t>
+      </w:r>
+      <w:r>
+        <w:t xml:space="preserve"> </w:t>
+      </w:r>
+      <w:r>
+        <w:t xml:space="preserve">an</w:t>
+      </w:r>
+      <w:r>
+        <w:t xml:space="preserve"> </w:t>
+      </w:r>
+      <w:r>
+        <w:t xml:space="preserve">As-</w:t>
+      </w:r>
+      <w:r>
+        <w:t xml:space="preserve"> </w:t>
+      </w:r>
+      <w:r>
+        <w:t xml:space="preserve">Applied</w:t>
+      </w:r>
+      <w:r>
+        <w:t xml:space="preserve"> </w:t>
+      </w:r>
+      <w:r>
+        <w:t xml:space="preserve">Challenge</w:t>
+      </w:r>
+      <w:r>
+        <w:t xml:space="preserve"> </w:t>
+      </w:r>
+      <w:r>
+        <w:t xml:space="preserve">Regarding</w:t>
+      </w:r>
+      <w:r>
+        <w:t xml:space="preserve"> </w:t>
+      </w:r>
+      <w:r>
+        <w:t xml:space="preserve">the</w:t>
+      </w:r>
+      <w:r>
+        <w:t xml:space="preserve"> </w:t>
+      </w:r>
+      <w:r>
+        <w:t xml:space="preserve">Credentials</w:t>
+      </w:r>
+      <w:r>
+        <w:t xml:space="preserve"> </w:t>
+      </w:r>
+      <w:r>
+        <w:t xml:space="preserve">and</w:t>
+      </w:r>
+      <w:r>
+        <w:t xml:space="preserve"> </w:t>
+      </w:r>
+      <w:r>
+        <w:t xml:space="preserve">Qualifications</w:t>
+      </w:r>
+      <w:r>
+        <w:t xml:space="preserve"> </w:t>
+      </w:r>
+      <w:r>
+        <w:t xml:space="preserve">of</w:t>
+      </w:r>
+      <w:r>
+        <w:t xml:space="preserve"> </w:t>
+      </w:r>
+      <w:r>
+        <w:t xml:space="preserve">the</w:t>
+      </w:r>
+      <w:r>
+        <w:t xml:space="preserve"> </w:t>
+      </w:r>
+      <w:r>
+        <w:t xml:space="preserve">State’s</w:t>
+      </w:r>
+      <w:r>
+        <w:t xml:space="preserve"> </w:t>
+      </w:r>
+      <w:r>
+        <w:t xml:space="preserve">Source</w:t>
+      </w:r>
+      <w:r>
+        <w:t xml:space="preserve"> </w:t>
+      </w:r>
+      <w:r>
+        <w:t xml:space="preserve">of</w:t>
+      </w:r>
+      <w:r>
+        <w:t xml:space="preserve"> </w:t>
+      </w:r>
+      <w:r>
+        <w:t xml:space="preserve">Lethal</w:t>
+      </w:r>
+      <w:r>
+        <w:t xml:space="preserve"> </w:t>
+      </w:r>
+      <w:r>
+        <w:t xml:space="preserve">Injection</w:t>
+      </w:r>
+      <w:r>
         <w:t xml:space="preserve">   </w:t>
       </w:r>
       <w:r>
@@ -1750,6 +2200,66 @@
         <w:t xml:space="preserve">in</w:t>
       </w:r>
       <w:r>
+        <w:t xml:space="preserve"> </w:t>
+      </w:r>
+      <w:r>
+        <w:t xml:space="preserve">Permitting</w:t>
+      </w:r>
+      <w:r>
+        <w:t xml:space="preserve"> </w:t>
+      </w:r>
+      <w:r>
+        <w:t xml:space="preserve">Appellees’</w:t>
+      </w:r>
+      <w:r>
+        <w:t xml:space="preserve"> </w:t>
+      </w:r>
+      <w:r>
+        <w:t xml:space="preserve">Expert</w:t>
+      </w:r>
+      <w:r>
+        <w:t xml:space="preserve"> </w:t>
+      </w:r>
+      <w:r>
+        <w:t xml:space="preserve">Dr.</w:t>
+      </w:r>
+      <w:r>
+        <w:t xml:space="preserve"> </w:t>
+      </w:r>
+      <w:r>
+        <w:t xml:space="preserve">Feng</w:t>
+      </w:r>
+      <w:r>
+        <w:t xml:space="preserve"> </w:t>
+      </w:r>
+      <w:r>
+        <w:t xml:space="preserve">Li</w:t>
+      </w:r>
+      <w:r>
+        <w:t xml:space="preserve"> </w:t>
+      </w:r>
+      <w:r>
+        <w:t xml:space="preserve">to</w:t>
+      </w:r>
+      <w:r>
+        <w:t xml:space="preserve"> </w:t>
+      </w:r>
+      <w:r>
+        <w:t xml:space="preserve">Testify</w:t>
+      </w:r>
+      <w:r>
+        <w:t xml:space="preserve"> </w:t>
+      </w:r>
+      <w:r>
+        <w:t xml:space="preserve">Out</w:t>
+      </w:r>
+      <w:r>
+        <w:t xml:space="preserve"> </w:t>
+      </w:r>
+      <w:r>
+        <w:t xml:space="preserve">of</w:t>
+      </w:r>
+      <w:r>
         <w:t xml:space="preserve">   </w:t>
       </w:r>
       <w:r>
@@ -1826,6 +2336,30 @@
         <w:t xml:space="preserve">Facts</w:t>
       </w:r>
       <w:r>
+        <w:t xml:space="preserve"> </w:t>
+      </w:r>
+      <w:r>
+        <w:t xml:space="preserve">Developed</w:t>
+      </w:r>
+      <w:r>
+        <w:t xml:space="preserve"> </w:t>
+      </w:r>
+      <w:r>
+        <w:t xml:space="preserve">in</w:t>
+      </w:r>
+      <w:r>
+        <w:t xml:space="preserve"> </w:t>
+      </w:r>
+      <w:r>
+        <w:t xml:space="preserve">Other</w:t>
+      </w:r>
+      <w:r>
+        <w:t xml:space="preserve"> </w:t>
+      </w:r>
+      <w:r>
+        <w:t xml:space="preserve">Cases.</w:t>
+      </w:r>
+      <w:r>
         <w:t xml:space="preserve">   </w:t>
       </w:r>
       <w:r>
@@ -1908,13 +2442,43 @@
         <w:t xml:space="preserve">on</w:t>
       </w:r>
       <w:r>
+        <w:t xml:space="preserve"> </w:t>
+      </w:r>
+      <w:r>
+        <w:t xml:space="preserve">the</w:t>
+      </w:r>
+      <w:r>
+        <w:t xml:space="preserve"> </w:t>
+      </w:r>
+      <w:r>
+        <w:t xml:space="preserve">Second</w:t>
+      </w:r>
+      <w:r>
+        <w:t xml:space="preserve"> </w:t>
+      </w:r>
+      <w:r>
+        <w:t xml:space="preserve">Element</w:t>
+      </w:r>
+      <w:r>
+        <w:t xml:space="preserve"> </w:t>
+      </w:r>
+      <w:r>
+        <w:t xml:space="preserve">of</w:t>
+      </w:r>
+      <w:r>
+        <w:t xml:space="preserve"> </w:t>
+      </w:r>
+      <w:r>
+        <w:t xml:space="preserve">Glossip.</w:t>
+      </w:r>
+      <w:r>
         <w:t xml:space="preserve">   </w:t>
       </w:r>
       <w:r>
         <w:tab/>
       </w:r>
       <w:r>
-        <w:t xml:space="preserve">51</w:t>
+        <w:t xml:space="preserve">50</w:t>
       </w:r>
     </w:p>
     <w:p>
@@ -1936,7 +2500,7 @@
         <w:tab/>
       </w:r>
       <w:r>
-        <w:t xml:space="preserve">58</w:t>
+        <w:t xml:space="preserve">57</w:t>
       </w:r>
     </w:p>
     <w:p>
@@ -2050,143 +2614,7 @@
         <w:pStyle w:val="BodyText"/>
       </w:pPr>
       <w:r>
-        <w:t xml:space="preserve">as those they are presenting for review:</w:t>
-      </w:r>
-    </w:p>
-    <w:p>
-      <w:pPr>
-        <w:pStyle w:val="BodyText"/>
-      </w:pPr>
-      <w:r>
-        <w:t xml:space="preserve">I. Whether Tennessee’s lethal injection protocol violates the Eighth Amendment to the United States Constitution or article I, section 16 of the Tennessee Constitution.</w:t>
-      </w:r>
-    </w:p>
-    <w:p>
-      <w:pPr>
-        <w:pStyle w:val="BodyText"/>
-      </w:pPr>
-      <w:r>
-        <w:t xml:space="preserve">II. Whether the Chancery Court erred in finding that Appellants failed to show that a single-drug pentobarbital lethal injection protocol was a known, feasible, and readily available alternative.</w:t>
-      </w:r>
-    </w:p>
-    <w:p>
-      <w:pPr>
-        <w:pStyle w:val="BodyText"/>
-      </w:pPr>
-      <w:r>
-        <w:t xml:space="preserve">III. Whether the Chancery Court erred in refusing to consider Appellants’ second alternative lethal injection protocol: a two-drug protocol, which eliminates vecuronium bromide.</w:t>
-      </w:r>
-    </w:p>
-    <w:p>
-      <w:pPr>
-        <w:pStyle w:val="BodyText"/>
-      </w:pPr>
-      <w:r>
-        <w:t xml:space="preserve">IV. Whether the Appellees waived the pleading requirement of a known, feasible, and readily available alternative by “refusing to produce the only source of information” regarding Appellees’ efforts to obtain pentobarbital.</w:t>
-      </w:r>
-    </w:p>
-    <w:p>
-      <w:pPr>
-        <w:pStyle w:val="BodyText"/>
-      </w:pPr>
-      <w:r>
-        <w:t xml:space="preserve">V. Whether the Chancery Court erred in denying discovery requests designed to discover evidence of the availability of pentobarbital to the State of Tennessee given that Texas and Georgia continue to use pentobarbital in executions.</w:t>
-      </w:r>
-    </w:p>
-    <w:p>
-      <w:pPr>
-        <w:pStyle w:val="BodyText"/>
-      </w:pPr>
-      <w:r>
-        <w:t xml:space="preserve">VI. Whether Tennessee’s “secrecy statute” excuses Appellants from the burden of establishing the availability of an alternative lethal injection protocol.</w:t>
-      </w:r>
-    </w:p>
-    <w:p>
-      <w:pPr>
-        <w:pStyle w:val="BodyText"/>
-      </w:pPr>
-      <w:r>
-        <w:t xml:space="preserve">VII. Whether the lethal injection protocol violates Appellees’ right to access to the courts.</w:t>
-      </w:r>
-    </w:p>
-    <w:p>
-      <w:pPr>
-        <w:pStyle w:val="BodyText"/>
-      </w:pPr>
-      <w:r>
-        <w:t xml:space="preserve">VIII. Whether the lethal injection protocol violates substantive due process under article 1, section 8 of the Tennessee Constitution and the Fourteenth Amendment of the United States Constitution.</w:t>
-      </w:r>
-    </w:p>
-    <w:p>
-      <w:pPr>
-        <w:pStyle w:val="BodyText"/>
-      </w:pPr>
-      <w:r>
-        <w:t xml:space="preserve">IX. Whether the lethal injection protocol violates Appellants’ “right to dignity” under article 1, section 16 of the Tennessee Constitution and the Eighth Amendment of the United States Constitution.</w:t>
-      </w:r>
-    </w:p>
-    <w:p>
-      <w:pPr>
-        <w:pStyle w:val="BodyText"/>
-      </w:pPr>
-      <w:r>
-        <w:t xml:space="preserve">X. Whether the lethal injection protocol violates the “dignity of man” by using lethal injection chemicals prohibited for use in non-livestock animal euthanasia in violation of article 1, section 16 of the Tennessee Constitution and the Eighth Amendment of the United States Constitution.</w:t>
-      </w:r>
-    </w:p>
-    <w:p>
-      <w:pPr>
-        <w:pStyle w:val="BodyText"/>
-      </w:pPr>
-      <w:r>
-        <w:t xml:space="preserve">XI. Whether the Chancery Court erred in denying Appellants’ pre-trial motion to amend the Complaint to add an as-applied challenge regarding the credentials and qualifications of the State’s source of lethal injection chemicals.</w:t>
-      </w:r>
-    </w:p>
-    <w:p>
-      <w:pPr>
-        <w:pStyle w:val="BodyText"/>
-      </w:pPr>
-      <w:r>
-        <w:t xml:space="preserve">XII. Whether the Chancery Court erred in permitting Appellees’ expert Dr. Feng Li to testify out of order.</w:t>
-      </w:r>
-    </w:p>
-    <w:p>
-      <w:pPr>
-        <w:pStyle w:val="BodyText"/>
-      </w:pPr>
-      <w:r>
-        <w:t xml:space="preserve">XIII. Whether the Chancery Court erred in failing to exclude the testimony of Appellees’ expert witnesses under McDaniel v. CSX Transportation, Inc., 955 S.W.2d 257 (Tenn. 1997).</w:t>
-      </w:r>
-    </w:p>
-    <w:p>
-      <w:pPr>
-        <w:pStyle w:val="BodyText"/>
-      </w:pPr>
-      <w:r>
-        <w:t xml:space="preserve">XIV. Whether this Court’s expedited appellate schedule violates the Appellants’ right to “appellate due process.”</w:t>
-      </w:r>
-    </w:p>
-    <w:p>
-      <w:pPr>
-        <w:pStyle w:val="BodyText"/>
-      </w:pPr>
-      <w:r>
-        <w:t xml:space="preserve">The Miller Appellants present the following additional issues for review:</w:t>
-      </w:r>
-    </w:p>
-    <w:p>
-      <w:pPr>
-        <w:pStyle w:val="BodyText"/>
-      </w:pPr>
-      <w:r>
-        <w:t xml:space="preserve">I. Whether the Chancery Court erred in relying on factual findings from other cases in addressing the first element of Glossip.</w:t>
-      </w:r>
-    </w:p>
-    <w:p>
-      <w:pPr>
-        <w:pStyle w:val="BodyText"/>
-      </w:pPr>
-      <w:r>
-        <w:t xml:space="preserve">II. Whether the Appellants were denied notice and an opportunity to be heard on the second element of Glossip.</w:t>
+        <w:t xml:space="preserve">as those they are presenting for review: I. Whether Tennessee’s lethal injection protocol violates the Eighth Amendment to the United States Constitution or article I, section 16 of the Tennessee Constitution. II. Whether the Chancery Court erred in finding that Appellants failed to show that a single-drug pentobarbital lethal injection protocol was a known, feasible, and readily available alternative. III. Whether the Chancery Court erred in refusing to consider Appellants’ second alternative lethal injection protocol: a two-drug protocol, which eliminates vecuronium bromide. IV. Whether the Appellees waived the pleading requirement of a known, feasible, and readily available alternative by “refusing to produce the only source of information” regarding Appellees’ efforts to obtain pentobarbital. V. Whether the Chancery Court erred in denying discovery requests designed to discover evidence of the availability of pentobarbital to the State of Tennessee given that Texas and Georgia continue to use pentobarbital in executions. VI. Whether Tennessee’s “secrecy statute” excuses Appellants from the burden of establishing the availability of an alternative lethal injection protocol. VII. Whether the lethal injection protocol violates Appellees’ right to access to the courts. VIII. Whether the lethal injection protocol violates substantive due process under article 1, section 8 of the Tennessee Constitution and the Fourteenth Amendment of the United States Constitution. IX. Whether the lethal injection protocol violates Appellants’ “right to dignity” under article 1, section 16 of the Tennessee Constitution and the Eighth Amendment of the United States Constitution. X. Whether the lethal injection protocol violates the “dignity of man” by using lethal injection chemicals prohibited for use in non-livestock animal euthanasia in violation of article 1, section 16 of the Tennessee Constitution and the Eighth Amendment of the United States Constitution. XI. Whether the Chancery Court erred in denying Appellants’ pre-trial motion to amend the Complaint to add an as-applied challenge regarding the credentials and qualifications of the State’s source of lethal injection chemicals. XII. Whether the Chancery Court erred in permitting Appellees’ expert Dr. Feng Li to testify out of order. XIII. Whether the Chancery Court erred in failing to exclude the testimony of Appellees’ expert witnesses under McDaniel v. CSX Transportation, Inc., 955 S.W.2d 257 (Tenn. 1997). XIV. Whether this Court’s expedited appellate schedule violates the Appellants’ right to “appellate due process.” The Miller Appellants present the following additional issues for review: I. Whether the Chancery Court erred in relying on factual findings from other cases in addressing the first element of Glossip. II. Whether the Appellants were denied notice and an opportunity to be heard on the second element of Glossip.</w:t>
       </w:r>
     </w:p>
     <w:p>
@@ -2294,63 +2722,7 @@
         <w:pStyle w:val="BodyText"/>
       </w:pPr>
       <w:r>
-        <w:t xml:space="preserve">Of the four expert witnesses the Inmates retained in this case,</w:t>
-      </w:r>
-    </w:p>
-    <w:p>
-      <w:pPr>
-        <w:pStyle w:val="BodyText"/>
-      </w:pPr>
-      <w:r>
-        <w:t xml:space="preserve">none were retained to investigate sources of pentobarbital to</w:t>
-      </w:r>
-    </w:p>
-    <w:p>
-      <w:pPr>
-        <w:pStyle w:val="BodyText"/>
-      </w:pPr>
-      <w:r>
-        <w:t xml:space="preserve">report to the Court the results of their search, e.g. whether</w:t>
-      </w:r>
-    </w:p>
-    <w:p>
-      <w:pPr>
-        <w:pStyle w:val="BodyText"/>
-      </w:pPr>
-      <w:r>
-        <w:t xml:space="preserve">they were rebuffed, whether the sources exist, etc., and none</w:t>
-      </w:r>
-    </w:p>
-    <w:p>
-      <w:pPr>
-        <w:pStyle w:val="BodyText"/>
-      </w:pPr>
-      <w:r>
-        <w:t xml:space="preserve">were able to provide any information on this critical element</w:t>
-      </w:r>
-    </w:p>
-    <w:p>
-      <w:pPr>
-        <w:pStyle w:val="BodyText"/>
-      </w:pPr>
-      <w:r>
-        <w:t xml:space="preserve">of the trial. . . . No good reason was provided to the Court as</w:t>
-      </w:r>
-    </w:p>
-    <w:p>
-      <w:pPr>
-        <w:pStyle w:val="BodyText"/>
-      </w:pPr>
-      <w:r>
-        <w:t xml:space="preserve">to why the Inmates failed to provide such important proof.</w:t>
-      </w:r>
-    </w:p>
-    <w:p>
-      <w:pPr>
-        <w:pStyle w:val="BodyText"/>
-      </w:pPr>
-      <w:r>
-        <w:t xml:space="preserve">XVI, 2241.</w:t>
+        <w:t xml:space="preserve">Of the four expert witnesses the Inmates retained in this case, none were retained to investigate sources of pentobarbital to report to the Court the results of their search, e.g. whether they were rebuffed, whether the sources exist, etc., and none were able to provide any information on this critical element of the trial. . . . No good reason was provided to the Court as to why the Inmates failed to provide such important proof. XVI, 2241.</w:t>
       </w:r>
     </w:p>
     <w:p>
@@ -2446,11 +2818,9 @@
         </w:rPr>
         <w:footnoteReference w:id="9"/>
       </w:r>
-    </w:p>
-    <w:p>
-      <w:pPr>
-        <w:pStyle w:val="BodyText"/>
-      </w:pPr>
+      <w:r>
+        <w:t xml:space="preserve"> </w:t>
+      </w:r>
       <w:r>
         <w:t xml:space="preserve">by lethal injection”). The Department of Correction is charged with implementing state law mandating lethal injection. Tenn. Code Ann. § 40-⁠23-⁠114(c).</w:t>
       </w:r>
@@ -2496,11 +2866,9 @@
         </w:rPr>
         <w:footnoteReference w:id="10"/>
       </w:r>
-    </w:p>
-    <w:p>
-      <w:pPr>
-        <w:pStyle w:val="BodyText"/>
-      </w:pPr>
+      <w:r>
+        <w:t xml:space="preserve"> </w:t>
+      </w:r>
       <w:r>
         <w:t xml:space="preserve">supply issues, the Department later eliminated pentobarbital from the protocol altogether. XXII, 1592; Trial Exhibit 2, 140.</w:t>
       </w:r>
@@ -2518,135 +2886,31 @@
         <w:pStyle w:val="BodyText"/>
       </w:pPr>
       <w:r>
-        <w:t xml:space="preserve">Baze [v. Rees, 553 U.S. 35 (2008)] cleared any legal obstacle to</w:t>
-      </w:r>
-    </w:p>
-    <w:p>
-      <w:pPr>
-        <w:pStyle w:val="BodyText"/>
-      </w:pPr>
-      <w:r>
-        <w:t xml:space="preserve">use of the most common three-drug protocol [using sodium</w:t>
-      </w:r>
-    </w:p>
-    <w:p>
-      <w:pPr>
-        <w:pStyle w:val="BodyText"/>
-      </w:pPr>
-      <w:r>
-        <w:t xml:space="preserve">thiopental] that had enabled States to carry out the death</w:t>
-      </w:r>
-    </w:p>
-    <w:p>
-      <w:pPr>
-        <w:pStyle w:val="BodyText"/>
-      </w:pPr>
-      <w:r>
-        <w:t xml:space="preserve">penalty in a quick and painless fashion. But a practical</w:t>
-      </w:r>
-    </w:p>
-    <w:p>
-      <w:pPr>
-        <w:pStyle w:val="BodyText"/>
-      </w:pPr>
-      <w:r>
-        <w:t xml:space="preserve">obstacle soon emerged, as anti-death-penalty advocates</w:t>
-      </w:r>
-    </w:p>
-    <w:p>
-      <w:pPr>
-        <w:pStyle w:val="BodyText"/>
-      </w:pPr>
-      <w:r>
-        <w:t xml:space="preserve">pressured pharmaceutical companies to refuse to supply the</w:t>
-      </w:r>
-    </w:p>
-    <w:p>
-      <w:pPr>
-        <w:pStyle w:val="BodyText"/>
-      </w:pPr>
-      <w:r>
-        <w:t xml:space="preserve">drugs used to carry out death sentences. . . . After other</w:t>
-      </w:r>
-    </w:p>
-    <w:p>
-      <w:pPr>
-        <w:pStyle w:val="BodyText"/>
-      </w:pPr>
-      <w:r>
-        <w:t xml:space="preserve">efforts to procure sodium thiopental proved unsuccessful,</w:t>
-      </w:r>
-    </w:p>
-    <w:p>
-      <w:pPr>
-        <w:pStyle w:val="BodyText"/>
-      </w:pPr>
-      <w:r>
-        <w:t xml:space="preserve">States sought an alternative, and they eventually replaced</w:t>
-      </w:r>
-    </w:p>
-    <w:p>
-      <w:pPr>
-        <w:pStyle w:val="BodyText"/>
-      </w:pPr>
-      <w:r>
-        <w:t xml:space="preserve">sodium thiopental with pentobarbital, another barbiturate.</w:t>
-      </w:r>
-    </w:p>
-    <w:p>
-      <w:pPr>
-        <w:pStyle w:val="BodyText"/>
-      </w:pPr>
-      <w:r>
-        <w:t xml:space="preserve">. . . Before long, however, pentobarbital also became</w:t>
-      </w:r>
-    </w:p>
-    <w:p>
-      <w:pPr>
-        <w:pStyle w:val="BodyText"/>
-      </w:pPr>
-      <w:r>
-        <w:t xml:space="preserve">unavailable. Anti-death-penalty advocates lobbied the</w:t>
-      </w:r>
-    </w:p>
-    <w:p>
-      <w:pPr>
-        <w:pStyle w:val="BodyText"/>
-      </w:pPr>
-      <w:r>
-        <w:t xml:space="preserve">Danish manufacturer of the drug to stop selling it for use in</w:t>
-      </w:r>
-    </w:p>
-    <w:p>
-      <w:pPr>
-        <w:pStyle w:val="BodyText"/>
-      </w:pPr>
-      <w:r>
-        <w:t xml:space="preserve">executions. . . . Unable to acquire either sodium thiopental</w:t>
-      </w:r>
-    </w:p>
-    <w:p>
-      <w:pPr>
-        <w:pStyle w:val="BodyText"/>
-      </w:pPr>
-      <w:r>
-        <w:t xml:space="preserve">or pentobarbital, some States have turned to midazolam, a</w:t>
-      </w:r>
-    </w:p>
-    <w:p>
-      <w:pPr>
-        <w:pStyle w:val="BodyText"/>
-      </w:pPr>
-      <w:r>
-        <w:t xml:space="preserve">sedative in the benzodiazepine family of drugs.</w:t>
-      </w:r>
-    </w:p>
-    <w:p>
-      <w:pPr>
-        <w:pStyle w:val="BodyText"/>
-      </w:pPr>
-      <w:r>
-        <w:t xml:space="preserve">Glossip, 135 S.Ct. at 2733</w:t>
+        <w:t xml:space="preserve">Baze [v. Rees, 553 U.S. 35 (2008)] cleared any legal obstacle to use of the most common three-drug protocol [using sodium thiopental] that had enabled States to carry out the death penalty in a quick and painless fashion. But a practical obstacle soon emerged, as anti-death-penalty advocates pressured pharmaceutical companies to refuse to supply the drugs used to carry out death sentences. . . . After other efforts to procure sodium thiopental proved unsuccessful,</w:t>
+      </w:r>
+    </w:p>
+    <w:p>
+      <w:pPr>
+        <w:pStyle w:val="BodyText"/>
+      </w:pPr>
+      <w:r>
+        <w:t xml:space="preserve">States sought an alternative, and they eventually replaced sodium thiopental with pentobarbital, another barbiturate.</w:t>
+      </w:r>
+    </w:p>
+    <w:p>
+      <w:pPr>
+        <w:pStyle w:val="BodyText"/>
+      </w:pPr>
+      <w:r>
+        <w:t xml:space="preserve">. . . Before long, however, pentobarbital also became unavailable. Anti-death-penalty advocates lobbied the</w:t>
+      </w:r>
+    </w:p>
+    <w:p>
+      <w:pPr>
+        <w:pStyle w:val="BodyText"/>
+      </w:pPr>
+      <w:r>
+        <w:t xml:space="preserve">Danish manufacturer of the drug to stop selling it for use in executions. . . . Unable to acquire either sodium thiopental or pentobarbital, some States have turned to midazolam, a sedative in the benzodiazepine family of drugs. Glossip, 135 S.Ct. at 2733</w:t>
       </w:r>
       <w:r>
         <w:noBreakHyphen/>
@@ -2660,23 +2924,7 @@
         <w:pStyle w:val="BodyText"/>
       </w:pPr>
       <w:r>
-        <w:t xml:space="preserve">The Department’s current protocol now calls for the administration of high doses of the sedative midazolam, following by a paralytic agent vecuronium bromide, followed by potassium chloride. Trial Exhibit 2, 140. The protocol is substantially the same as the one approved by the</w:t>
-      </w:r>
-    </w:p>
-    <w:p>
-      <w:pPr>
-        <w:pStyle w:val="BodyText"/>
-      </w:pPr>
-      <w:r>
-        <w:t xml:space="preserve">“is uncertain due to ongoing difficulty in obtaining the necessary lethal injection chemicals.” Motion at 1. The State further asserted, “Despite continuing efforts to identify an alternate source of pentobarbital, the Department currently has none on hand and no known source to obtain more.” Motion at 2.</w:t>
-      </w:r>
-    </w:p>
-    <w:p>
-      <w:pPr>
-        <w:pStyle w:val="BodyText"/>
-      </w:pPr>
-      <w:r>
-        <w:t xml:space="preserve">United States Supreme Court in Glossip, 135 S.Ct. at 2734</w:t>
+        <w:t xml:space="preserve">The Department’s current protocol now calls for the administration of high doses of the sedative midazolam, following by a paralytic agent vecuronium bromide, followed by potassium chloride. Trial Exhibit 2, 140. The protocol is substantially the same as the one approved by the “is uncertain due to ongoing difficulty in obtaining the necessary lethal injection chemicals.” Motion at 1. The State further asserted, “Despite continuing efforts to identify an alternate source of pentobarbital, the Department currently has none on hand and no known source to obtain more.” Motion at 2. United States Supreme Court in Glossip, 135 S.Ct. at 2734</w:t>
       </w:r>
       <w:r>
         <w:noBreakHyphen/>
@@ -2814,21 +3062,257 @@
         </w:rPr>
         <w:t xml:space="preserve">Violate</w:t>
       </w:r>
-    </w:p>
-    <w:p>
-      <w:pPr>
-        <w:pStyle w:val="BodyText"/>
-      </w:pPr>
-      <w:r>
-        <w:t xml:space="preserve">Appellants’ Rights Under the Eighth Amendment to the</w:t>
-      </w:r>
-    </w:p>
-    <w:p>
-      <w:pPr>
-        <w:pStyle w:val="BodyText"/>
-      </w:pPr>
-      <w:r>
-        <w:t xml:space="preserve">United States Constitution or Article 1, Section 16 of the</w:t>
+      <w:r>
+        <w:rPr>
+          <w:b/>
+          <w:bCs/>
+        </w:rPr>
+        <w:t xml:space="preserve"> </w:t>
+      </w:r>
+      <w:r>
+        <w:rPr>
+          <w:b/>
+          <w:bCs/>
+        </w:rPr>
+        <w:t xml:space="preserve">Appellants’</w:t>
+      </w:r>
+      <w:r>
+        <w:rPr>
+          <w:b/>
+          <w:bCs/>
+        </w:rPr>
+        <w:t xml:space="preserve"> </w:t>
+      </w:r>
+      <w:r>
+        <w:rPr>
+          <w:b/>
+          <w:bCs/>
+        </w:rPr>
+        <w:t xml:space="preserve">Rights</w:t>
+      </w:r>
+      <w:r>
+        <w:rPr>
+          <w:b/>
+          <w:bCs/>
+        </w:rPr>
+        <w:t xml:space="preserve"> </w:t>
+      </w:r>
+      <w:r>
+        <w:rPr>
+          <w:b/>
+          <w:bCs/>
+        </w:rPr>
+        <w:t xml:space="preserve">Under</w:t>
+      </w:r>
+      <w:r>
+        <w:rPr>
+          <w:b/>
+          <w:bCs/>
+        </w:rPr>
+        <w:t xml:space="preserve"> </w:t>
+      </w:r>
+      <w:r>
+        <w:rPr>
+          <w:b/>
+          <w:bCs/>
+        </w:rPr>
+        <w:t xml:space="preserve">the</w:t>
+      </w:r>
+      <w:r>
+        <w:rPr>
+          <w:b/>
+          <w:bCs/>
+        </w:rPr>
+        <w:t xml:space="preserve"> </w:t>
+      </w:r>
+      <w:r>
+        <w:rPr>
+          <w:b/>
+          <w:bCs/>
+        </w:rPr>
+        <w:t xml:space="preserve">Eighth</w:t>
+      </w:r>
+      <w:r>
+        <w:rPr>
+          <w:b/>
+          <w:bCs/>
+        </w:rPr>
+        <w:t xml:space="preserve"> </w:t>
+      </w:r>
+      <w:r>
+        <w:rPr>
+          <w:b/>
+          <w:bCs/>
+        </w:rPr>
+        <w:t xml:space="preserve">Amendment</w:t>
+      </w:r>
+      <w:r>
+        <w:rPr>
+          <w:b/>
+          <w:bCs/>
+        </w:rPr>
+        <w:t xml:space="preserve"> </w:t>
+      </w:r>
+      <w:r>
+        <w:rPr>
+          <w:b/>
+          <w:bCs/>
+        </w:rPr>
+        <w:t xml:space="preserve">to</w:t>
+      </w:r>
+      <w:r>
+        <w:rPr>
+          <w:b/>
+          <w:bCs/>
+        </w:rPr>
+        <w:t xml:space="preserve"> </w:t>
+      </w:r>
+      <w:r>
+        <w:rPr>
+          <w:b/>
+          <w:bCs/>
+        </w:rPr>
+        <w:t xml:space="preserve">the</w:t>
+      </w:r>
+      <w:r>
+        <w:rPr>
+          <w:b/>
+          <w:bCs/>
+        </w:rPr>
+        <w:t xml:space="preserve"> </w:t>
+      </w:r>
+      <w:r>
+        <w:rPr>
+          <w:b/>
+          <w:bCs/>
+        </w:rPr>
+        <w:t xml:space="preserve">United</w:t>
+      </w:r>
+      <w:r>
+        <w:rPr>
+          <w:b/>
+          <w:bCs/>
+        </w:rPr>
+        <w:t xml:space="preserve"> </w:t>
+      </w:r>
+      <w:r>
+        <w:rPr>
+          <w:b/>
+          <w:bCs/>
+        </w:rPr>
+        <w:t xml:space="preserve">States</w:t>
+      </w:r>
+      <w:r>
+        <w:rPr>
+          <w:b/>
+          <w:bCs/>
+        </w:rPr>
+        <w:t xml:space="preserve"> </w:t>
+      </w:r>
+      <w:r>
+        <w:rPr>
+          <w:b/>
+          <w:bCs/>
+        </w:rPr>
+        <w:t xml:space="preserve">Constitution</w:t>
+      </w:r>
+      <w:r>
+        <w:rPr>
+          <w:b/>
+          <w:bCs/>
+        </w:rPr>
+        <w:t xml:space="preserve"> </w:t>
+      </w:r>
+      <w:r>
+        <w:rPr>
+          <w:b/>
+          <w:bCs/>
+        </w:rPr>
+        <w:t xml:space="preserve">or</w:t>
+      </w:r>
+      <w:r>
+        <w:rPr>
+          <w:b/>
+          <w:bCs/>
+        </w:rPr>
+        <w:t xml:space="preserve"> </w:t>
+      </w:r>
+      <w:r>
+        <w:rPr>
+          <w:b/>
+          <w:bCs/>
+        </w:rPr>
+        <w:t xml:space="preserve">Article</w:t>
+      </w:r>
+      <w:r>
+        <w:rPr>
+          <w:b/>
+          <w:bCs/>
+        </w:rPr>
+        <w:t xml:space="preserve"> </w:t>
+      </w:r>
+      <w:r>
+        <w:rPr>
+          <w:b/>
+          <w:bCs/>
+        </w:rPr>
+        <w:t xml:space="preserve">1,</w:t>
+      </w:r>
+      <w:r>
+        <w:rPr>
+          <w:b/>
+          <w:bCs/>
+        </w:rPr>
+        <w:t xml:space="preserve"> </w:t>
+      </w:r>
+      <w:r>
+        <w:rPr>
+          <w:b/>
+          <w:bCs/>
+        </w:rPr>
+        <w:t xml:space="preserve">Section</w:t>
+      </w:r>
+      <w:r>
+        <w:rPr>
+          <w:b/>
+          <w:bCs/>
+        </w:rPr>
+        <w:t xml:space="preserve"> </w:t>
+      </w:r>
+      <w:r>
+        <w:rPr>
+          <w:b/>
+          <w:bCs/>
+        </w:rPr>
+        <w:t xml:space="preserve">16</w:t>
+      </w:r>
+      <w:r>
+        <w:rPr>
+          <w:b/>
+          <w:bCs/>
+        </w:rPr>
+        <w:t xml:space="preserve"> </w:t>
+      </w:r>
+      <w:r>
+        <w:rPr>
+          <w:b/>
+          <w:bCs/>
+        </w:rPr>
+        <w:t xml:space="preserve">of</w:t>
+      </w:r>
+      <w:r>
+        <w:rPr>
+          <w:b/>
+          <w:bCs/>
+        </w:rPr>
+        <w:t xml:space="preserve"> </w:t>
+      </w:r>
+      <w:r>
+        <w:rPr>
+          <w:b/>
+          <w:bCs/>
+        </w:rPr>
+        <w:t xml:space="preserve">the</w:t>
       </w:r>
     </w:p>
     <w:p>
@@ -2916,11 +3400,9 @@
         </w:rPr>
         <w:footnoteReference w:id="11"/>
       </w:r>
-    </w:p>
-    <w:p>
-      <w:pPr>
-        <w:pStyle w:val="BodyText"/>
-      </w:pPr>
+      <w:r>
+        <w:t xml:space="preserve"> </w:t>
+      </w:r>
       <w:r>
         <w:t xml:space="preserve">with no presumption of correctness. State v. Davis, 354 S.W.3d 718 (Tenn. 2011).</w:t>
       </w:r>
@@ -3050,11 +3532,9 @@
         </w:rPr>
         <w:footnoteReference w:id="12"/>
       </w:r>
-    </w:p>
-    <w:p>
-      <w:pPr>
-        <w:pStyle w:val="BodyText"/>
-      </w:pPr>
+      <w:r>
+        <w:t xml:space="preserve"> </w:t>
+      </w:r>
       <w:r>
         <w:t xml:space="preserve">“[w]hat each of the forbidden [capital] punishments had in common was the deliberate infliction of pain for the sake of pain—‘superadd[ing]’ pain to the death sentence through torture and the like.” Id.</w:t>
       </w:r>
@@ -3412,15 +3892,7 @@
         <w:pStyle w:val="BodyText"/>
       </w:pPr>
       <w:r>
-        <w:t xml:space="preserve">Glossip did not define “feasible and readily implemented.” But numerous courts since Glossip have discussed an inmate’s burden of proving this element. The Sixth Circuit held that an alternative is “available” and “readily implemented” if a State is able to obtain drugs</w:t>
-      </w:r>
-    </w:p>
-    <w:p>
-      <w:pPr>
-        <w:pStyle w:val="BodyText"/>
-      </w:pPr>
-      <w:r>
-        <w:t xml:space="preserve">with “ordinary transactional effort.” In re Ohio Execution Protocol 860 F.3d 881, 890</w:t>
+        <w:t xml:space="preserve">Glossip did not define “feasible and readily implemented.” But numerous courts since Glossip have discussed an inmate’s burden of proving this element. The Sixth Circuit held that an alternative is “available” and “readily implemented” if a State is able to obtain drugs with “ordinary transactional effort.” In re Ohio Execution Protocol 860 F.3d 881, 890</w:t>
       </w:r>
       <w:r>
         <w:noBreakHyphen/>
@@ -3448,15 +3920,7 @@
         <w:pStyle w:val="BodyText"/>
       </w:pPr>
       <w:r>
-        <w:t xml:space="preserve">The Chancery Court here determined that “pentobarbital is not available to the Defendants.” XVI, 2249. That ruling is fully supported by the record. First, the Court accredited the testimony of the State officials describing the Department’s unsuccessful efforts to obtain the drug. XVI, 2242. Commissioner of Correction Tony Parker testified that,</w:t>
-      </w:r>
-    </w:p>
-    <w:p>
-      <w:pPr>
-        <w:pStyle w:val="BodyText"/>
-      </w:pPr>
-      <w:r>
-        <w:t xml:space="preserve">despite exhaustive efforts—including contacting nearly 100 potential sources including three major U.S. chemical wholesalers—the Department was not able to obtain pentobarbital for use in executions. XXXVII, 1338, 1353</w:t>
+        <w:t xml:space="preserve">The Chancery Court here determined that “pentobarbital is not available to the Defendants.” XVI, 2249. That ruling is fully supported by the record. First, the Court accredited the testimony of the State officials describing the Department’s unsuccessful efforts to obtain the drug. XVI, 2242. Commissioner of Correction Tony Parker testified that, despite exhaustive efforts—including contacting nearly 100 potential sources including three major U.S. chemical wholesalers—the Department was not able to obtain pentobarbital for use in executions. XXXVII, 1338, 1353</w:t>
       </w:r>
       <w:r>
         <w:noBreakHyphen/>
@@ -3504,63 +3968,7 @@
         <w:pStyle w:val="BodyText"/>
       </w:pPr>
       <w:r>
-        <w:t xml:space="preserve">Of the four expert witnesses the Inmates retained in this case,</w:t>
-      </w:r>
-    </w:p>
-    <w:p>
-      <w:pPr>
-        <w:pStyle w:val="BodyText"/>
-      </w:pPr>
-      <w:r>
-        <w:t xml:space="preserve">none were retained to investigate sources of pentobarbital to</w:t>
-      </w:r>
-    </w:p>
-    <w:p>
-      <w:pPr>
-        <w:pStyle w:val="BodyText"/>
-      </w:pPr>
-      <w:r>
-        <w:t xml:space="preserve">report to the Court the results of their search, e.g. whether</w:t>
-      </w:r>
-    </w:p>
-    <w:p>
-      <w:pPr>
-        <w:pStyle w:val="BodyText"/>
-      </w:pPr>
-      <w:r>
-        <w:t xml:space="preserve">they were rebuffed, whether the sources exist, etc., and none</w:t>
-      </w:r>
-    </w:p>
-    <w:p>
-      <w:pPr>
-        <w:pStyle w:val="BodyText"/>
-      </w:pPr>
-      <w:r>
-        <w:t xml:space="preserve">were able to provide any information on this critical element</w:t>
-      </w:r>
-    </w:p>
-    <w:p>
-      <w:pPr>
-        <w:pStyle w:val="BodyText"/>
-      </w:pPr>
-      <w:r>
-        <w:t xml:space="preserve">of the trial. . . . No good reason was provided to the Court as</w:t>
-      </w:r>
-    </w:p>
-    <w:p>
-      <w:pPr>
-        <w:pStyle w:val="BodyText"/>
-      </w:pPr>
-      <w:r>
-        <w:t xml:space="preserve">to why the Inmates failed to provide such important proof.</w:t>
-      </w:r>
-    </w:p>
-    <w:p>
-      <w:pPr>
-        <w:pStyle w:val="BodyText"/>
-      </w:pPr>
-      <w:r>
-        <w:t xml:space="preserve">XVI, 2241.</w:t>
+        <w:t xml:space="preserve">Of the four expert witnesses the Inmates retained in this case, none were retained to investigate sources of pentobarbital to report to the Court the results of their search, e.g. whether they were rebuffed, whether the sources exist, etc., and none were able to provide any information on this critical element of the trial. . . . No good reason was provided to the Court as to why the Inmates failed to provide such important proof. XVI, 2241.</w:t>
       </w:r>
     </w:p>
     <w:p>
@@ -3590,15 +3998,7 @@
         <w:noBreakHyphen/>
       </w:r>
       <w:r>
-        <w:t xml:space="preserve">55. Commissioner Parker further testified that if the Department had a source of Pentobarbital, it would be used.” XXXVII, 1355. Commissioner Parker’s testimony was credited by the trial court. And, as the trial court pointedly noted, it “defies common sense that the State would not make the effort to locate pentobarbital,” since this Court has already upheld its use. XVI, 2247.</w:t>
-      </w:r>
-    </w:p>
-    <w:p>
-      <w:pPr>
-        <w:pStyle w:val="BodyText"/>
-      </w:pPr>
-      <w:r>
-        <w:t xml:space="preserve">Appellants point to no evidence that shows a supplier willing to sell pentobarbital to the Department for use in executions. And they presented not one iota of proof in the Chancery Court on the availability of pentobarbital for executions, despite assembling multiple experts in the field of pharmacology and anesthesiology. XVI, 2241, 2245</w:t>
+        <w:t xml:space="preserve">55. Commissioner Parker further testified that if the Department had a source of Pentobarbital, it would be used.” XXXVII, 1355. Commissioner Parker’s testimony was credited by the trial court. And, as the trial court pointedly noted, it “defies common sense that the State would not make the effort to locate pentobarbital,” since this Court has already upheld its use. XVI, 2247. Appellants point to no evidence that shows a supplier willing to sell pentobarbital to the Department for use in executions. And they presented not one iota of proof in the Chancery Court on the availability of pentobarbital for executions, despite assembling multiple experts in the field of pharmacology and anesthesiology. XVI, 2241, 2245</w:t>
       </w:r>
       <w:r>
         <w:noBreakHyphen/>
@@ -3642,119 +4042,15 @@
         <w:pStyle w:val="BodyText"/>
       </w:pPr>
       <w:r>
-        <w:t xml:space="preserve">[T]he United States Supreme Court requires inmates,</w:t>
-      </w:r>
-    </w:p>
-    <w:p>
-      <w:pPr>
-        <w:pStyle w:val="BodyText"/>
-      </w:pPr>
-      <w:r>
-        <w:t xml:space="preserve">challenging a State’s method of execution as unconstitutional,</w:t>
-      </w:r>
-    </w:p>
-    <w:p>
-      <w:pPr>
-        <w:pStyle w:val="BodyText"/>
-      </w:pPr>
-      <w:r>
-        <w:t xml:space="preserve">to prove that there is a known and available alternative</w:t>
-      </w:r>
-    </w:p>
-    <w:p>
-      <w:pPr>
-        <w:pStyle w:val="BodyText"/>
-      </w:pPr>
-      <w:r>
-        <w:t xml:space="preserve">method of execution. With the realities of the supply of lethal</w:t>
-      </w:r>
-    </w:p>
-    <w:p>
-      <w:pPr>
-        <w:pStyle w:val="BodyText"/>
-      </w:pPr>
-      <w:r>
-        <w:t xml:space="preserve">injection drugs diminishing and drug options narrowing for</w:t>
-      </w:r>
-    </w:p>
-    <w:p>
-      <w:pPr>
-        <w:pStyle w:val="BodyText"/>
-      </w:pPr>
-      <w:r>
-        <w:t xml:space="preserve">prisons, requiring inmates, seeking to halt executions, to</w:t>
-      </w:r>
-    </w:p>
-    <w:p>
-      <w:pPr>
-        <w:pStyle w:val="BodyText"/>
-      </w:pPr>
-      <w:r>
-        <w:t xml:space="preserve">prove other alternatives exist addresses these realities. In</w:t>
-      </w:r>
-    </w:p>
-    <w:p>
-      <w:pPr>
-        <w:pStyle w:val="BodyText"/>
-      </w:pPr>
-      <w:r>
-        <w:t xml:space="preserve">this case the Inmates have not done this. They have not</w:t>
-      </w:r>
-    </w:p>
-    <w:p>
-      <w:pPr>
-        <w:pStyle w:val="BodyText"/>
-      </w:pPr>
-      <w:r>
-        <w:t xml:space="preserve">demonstrated that their proposed alternative of pentobarbital</w:t>
-      </w:r>
-    </w:p>
-    <w:p>
-      <w:pPr>
-        <w:pStyle w:val="BodyText"/>
-      </w:pPr>
-      <w:r>
-        <w:t xml:space="preserve">is available to the State of Tennessee for their executions.</w:t>
-      </w:r>
-    </w:p>
-    <w:p>
-      <w:pPr>
-        <w:pStyle w:val="BodyText"/>
-      </w:pPr>
-      <w:r>
-        <w:t xml:space="preserve">Under these circumstances, the law of the United States</w:t>
-      </w:r>
-    </w:p>
-    <w:p>
-      <w:pPr>
-        <w:pStyle w:val="BodyText"/>
-      </w:pPr>
-      <w:r>
-        <w:t xml:space="preserve">requires Count I of the Second Amended Complaint to be</w:t>
-      </w:r>
-    </w:p>
-    <w:p>
-      <w:pPr>
-        <w:pStyle w:val="BodyText"/>
-      </w:pPr>
-      <w:r>
-        <w:t xml:space="preserve">dismissed, and that use of the July 5, 2018 three-drug protocol</w:t>
-      </w:r>
-    </w:p>
-    <w:p>
-      <w:pPr>
-        <w:pStyle w:val="BodyText"/>
-      </w:pPr>
-      <w:r>
-        <w:t xml:space="preserve">may proceed.</w:t>
-      </w:r>
-    </w:p>
-    <w:p>
-      <w:pPr>
-        <w:pStyle w:val="BodyText"/>
-      </w:pPr>
-      <w:r>
-        <w:t xml:space="preserve">XVI, 2264.</w:t>
+        <w:t xml:space="preserve">[T]he United States Supreme Court requires inmates, challenging a State’s method of execution as unconstitutional, to prove that there is a known and available alternative method of execution. With the realities of the supply of lethal injection drugs diminishing and drug options narrowing for prisons, requiring inmates, seeking to halt executions, to prove other alternatives exist addresses these realities. In this case the Inmates have not done this. They have not demonstrated that their proposed alternative of pentobarbital is available to the State of Tennessee for their executions.</w:t>
+      </w:r>
+    </w:p>
+    <w:p>
+      <w:pPr>
+        <w:pStyle w:val="BodyText"/>
+      </w:pPr>
+      <w:r>
+        <w:t xml:space="preserve">Under these circumstances, the law of the United States requires Count I of the Second Amended Complaint to be dismissed, and that use of the July 5, 2018 three-drug protocol may proceed. XVI, 2264.</w:t>
       </w:r>
     </w:p>
     <w:p>
@@ -3954,15 +4250,7 @@
         <w:pStyle w:val="BodyText"/>
       </w:pPr>
       <w:r>
-        <w:t xml:space="preserve">Although not necessary to its disposition of Appellants’ Eighth Amendment claim, the Chancery Court also found that the Appellants failed to prove the other element of Glossip—that the protocol creates a substantial risk of severe pain. Glossip, 135 S.Ct. at 2731, 2740. XVI, 2258 (“[T]he Inmates have not established the other Glossip prong that with the use of midazolam there is an objectively intolerable risk of harm.”).</w:t>
-      </w:r>
-    </w:p>
-    <w:p>
-      <w:pPr>
-        <w:pStyle w:val="BodyText"/>
-      </w:pPr>
-      <w:r>
-        <w:t xml:space="preserve">A prisoner cannot successfully challenge a method of execution unless he shows that the method presents a risk that is “‘sure or very likely to cause serious illness and needless suffering,’ and will give rise to ‘sufficiently imminent dangers.’” Baze, 553 U.S. at 50 (quoting Helling v. McKinney, 509 U.S. 25, 33, 34</w:t>
+        <w:t xml:space="preserve">Although not necessary to its disposition of Appellants’ Eighth Amendment claim, the Chancery Court also found that the Appellants failed to prove the other element of Glossip—that the protocol creates a substantial risk of severe pain. Glossip, 135 S.Ct. at 2731, 2740. XVI, 2258 (“[T]he Inmates have not established the other Glossip prong that with the use of midazolam there is an objectively intolerable risk of harm.”). A prisoner cannot successfully challenge a method of execution unless he shows that the method presents a risk that is “‘sure or very likely to cause serious illness and needless suffering,’ and will give rise to ‘sufficiently imminent dangers.’” Baze, 553 U.S. at 50 (quoting Helling v. McKinney, 509 U.S. 25, 33, 34</w:t>
       </w:r>
       <w:r>
         <w:noBreakHyphen/>
@@ -3984,15 +4272,7 @@
         <w:pStyle w:val="BodyText"/>
       </w:pPr>
       <w:r>
-        <w:t xml:space="preserve">The Chancery Court observed that “17 executions using a midazolam three-drug protocol have taken place since the United States Supreme Court decided Glossip on June 29, 2015, and none of those executions have been stopped from proceeding by the United States Supreme Court. Of the six states that have conducted an execution using a three-drug midazolam protocol, the United States Supreme Court has never held their protocol unconstitutional.” XVI, 2257.</w:t>
-      </w:r>
-    </w:p>
-    <w:p>
-      <w:pPr>
-        <w:pStyle w:val="BodyText"/>
-      </w:pPr>
-      <w:r>
-        <w:t xml:space="preserve">And since the Chancery Court made those observations, there is now a seventh instance in which the Supreme Court did not hold the three-drug midazolam protocol unconstitutional. It again declined to do so when it declined to enjoin the execution of Billy Ray Irick using the Department’s three-drug midazolam method on the same record and presented with many of the same arguments now before this Court. Irick v. Tennessee, __ S.Ct. __, 2018 WL 3767151 (Aug. 9, 2018).</w:t>
+        <w:t xml:space="preserve">The Chancery Court observed that “17 executions using a midazolam three-drug protocol have taken place since the United States Supreme Court decided Glossip on June 29, 2015, and none of those executions have been stopped from proceeding by the United States Supreme Court. Of the six states that have conducted an execution using a three-drug midazolam protocol, the United States Supreme Court has never held their protocol unconstitutional.” XVI, 2257. And since the Chancery Court made those observations, there is now a seventh instance in which the Supreme Court did not hold the three-drug midazolam protocol unconstitutional. It again declined to do so when it declined to enjoin the execution of Billy Ray Irick using the Department’s three-drug midazolam method on the same record and presented with many of the same arguments now before this Court. Irick v. Tennessee, __ S.Ct. __, 2018 WL 3767151 (Aug. 9, 2018).</w:t>
       </w:r>
     </w:p>
     <w:p>
@@ -4014,15 +4294,7 @@
         <w:pStyle w:val="BodyText"/>
       </w:pPr>
       <w:r>
-        <w:t xml:space="preserve">The proof in these cases, and some of the witnesses themselves, have been similar, if not identical. See, e.g., Glossip, 135 S.Ct. at 2739-</w:t>
-      </w:r>
-    </w:p>
-    <w:p>
-      <w:pPr>
-        <w:pStyle w:val="BodyText"/>
-      </w:pPr>
-      <w:r>
-        <w:t xml:space="preserve">40 (listing cases). Appellants insist, however, that the Court should reach a different result in this case because they presented proof of an additional physical reaction to midazolam and testimony from witnesses who observed executions in other states. But that provides no basis for the departure Appellants seek.</w:t>
+        <w:t xml:space="preserve">The proof in these cases, and some of the witnesses themselves, have been similar, if not identical. See, e.g., Glossip, 135 S.Ct. at 2739- 40 (listing cases). Appellants insist, however, that the Court should reach a different result in this case because they presented proof of an additional physical reaction to midazolam and testimony from witnesses who observed executions in other states. But that provides no basis for the departure Appellants seek.</w:t>
       </w:r>
     </w:p>
     <w:p>
@@ -4052,15 +4324,7 @@
         <w:pStyle w:val="BodyText"/>
       </w:pPr>
       <w:r>
-        <w:t xml:space="preserve">The Chancery Court examined several factors to determine whether the risk was “objectively intolerable” under the Eighth Amendment: (1) case law examining the use of midazolam; (2) official documentation and demonstrative evidence submitted by both parties of twenty executions using midazolam performed by the Departments of</w:t>
-      </w:r>
-    </w:p>
-    <w:p>
-      <w:pPr>
-        <w:pStyle w:val="BodyText"/>
-      </w:pPr>
-      <w:r>
-        <w:t xml:space="preserve">Correction of Florida, Arkansas, and Ohio, which established an average duration of executions using a midazolam-based three-drug protocol of 13.55 minutes; and (3) eyewitness accounts of lethal injection executions performed in other States. XVI, 2252</w:t>
+        <w:t xml:space="preserve">The Chancery Court examined several factors to determine whether the risk was “objectively intolerable” under the Eighth Amendment: (1) case law examining the use of midazolam; (2) official documentation and demonstrative evidence submitted by both parties of twenty executions using midazolam performed by the Departments of Correction of Florida, Arkansas, and Ohio, which established an average duration of executions using a midazolam-based three-drug protocol of 13.55 minutes; and (3) eyewitness accounts of lethal injection executions performed in other States. XVI, 2252</w:t>
       </w:r>
       <w:r>
         <w:noBreakHyphen/>
@@ -4082,15 +4346,7 @@
         <w:pStyle w:val="BodyText"/>
       </w:pPr>
       <w:r>
-        <w:t xml:space="preserve">Appellants’ use of extreme rhetoric to describe an execution method, e.g., burning at the stake, being buried alive, and the like, adds nothing to the constitutional analysis. Although those are surely forms of torture, the incidental physical consequences of an execution are not. See Glossip, 135 S.Ct. at 2746 (“[W]e find it appropriate to respond to the principal dissent’s groundless suggestion that our decision is tantamount to allowing prisoners to be “drawn and quartered, slowly tortured to death, or actually burned at the stake.” . . . That is simply not true, and the principal dissent’s resort to this outlandish rhetoric reveals the weakness of its legal arguments.”).</w:t>
-      </w:r>
-    </w:p>
-    <w:p>
-      <w:pPr>
-        <w:pStyle w:val="BodyText"/>
-      </w:pPr>
-      <w:r>
-        <w:t xml:space="preserve">The Eighth Amendment prohibits only those “[m]ethods of execution” that are “deliberately designed to inflict pain.” Baze, 553 U.S. at 35. There is no proof in this record of any action by any Defendant to deliberately torture any death row inmate.</w:t>
+        <w:t xml:space="preserve">Appellants’ use of extreme rhetoric to describe an execution method, e.g., burning at the stake, being buried alive, and the like, adds nothing to the constitutional analysis. Although those are surely forms of torture, the incidental physical consequences of an execution are not. See Glossip, 135 S.Ct. at 2746 (“[W]e find it appropriate to respond to the principal dissent’s groundless suggestion that our decision is tantamount to allowing prisoners to be “drawn and quartered, slowly tortured to death, or actually burned at the stake.” . . . That is simply not true, and the principal dissent’s resort to this outlandish rhetoric reveals the weakness of its legal arguments.”). The Eighth Amendment prohibits only those “[m]ethods of execution” that are “deliberately designed to inflict pain.” Baze, 553 U.S. at 35. There is no proof in this record of any action by any Defendant to deliberately torture any death row inmate.</w:t>
       </w:r>
     </w:p>
     <w:p>
@@ -4242,13 +4498,89 @@
         </w:rPr>
         <w:t xml:space="preserve">in</w:t>
       </w:r>
-    </w:p>
-    <w:p>
-      <w:pPr>
-        <w:pStyle w:val="BodyText"/>
-      </w:pPr>
-      <w:r>
-        <w:t xml:space="preserve">Denying Appellants’ Eleventh-Hour Request to Amend</w:t>
+      <w:r>
+        <w:rPr>
+          <w:b/>
+          <w:bCs/>
+        </w:rPr>
+        <w:t xml:space="preserve"> </w:t>
+      </w:r>
+      <w:r>
+        <w:rPr>
+          <w:b/>
+          <w:bCs/>
+        </w:rPr>
+        <w:t xml:space="preserve">Denying</w:t>
+      </w:r>
+      <w:r>
+        <w:rPr>
+          <w:b/>
+          <w:bCs/>
+        </w:rPr>
+        <w:t xml:space="preserve"> </w:t>
+      </w:r>
+      <w:r>
+        <w:rPr>
+          <w:b/>
+          <w:bCs/>
+        </w:rPr>
+        <w:t xml:space="preserve">Appellants’</w:t>
+      </w:r>
+      <w:r>
+        <w:rPr>
+          <w:b/>
+          <w:bCs/>
+        </w:rPr>
+        <w:t xml:space="preserve"> </w:t>
+      </w:r>
+      <w:r>
+        <w:rPr>
+          <w:b/>
+          <w:bCs/>
+        </w:rPr>
+        <w:t xml:space="preserve">Eleventh-Hour</w:t>
+      </w:r>
+      <w:r>
+        <w:rPr>
+          <w:b/>
+          <w:bCs/>
+        </w:rPr>
+        <w:t xml:space="preserve"> </w:t>
+      </w:r>
+      <w:r>
+        <w:rPr>
+          <w:b/>
+          <w:bCs/>
+        </w:rPr>
+        <w:t xml:space="preserve">Request</w:t>
+      </w:r>
+      <w:r>
+        <w:rPr>
+          <w:b/>
+          <w:bCs/>
+        </w:rPr>
+        <w:t xml:space="preserve"> </w:t>
+      </w:r>
+      <w:r>
+        <w:rPr>
+          <w:b/>
+          <w:bCs/>
+        </w:rPr>
+        <w:t xml:space="preserve">to</w:t>
+      </w:r>
+      <w:r>
+        <w:rPr>
+          <w:b/>
+          <w:bCs/>
+        </w:rPr>
+        <w:t xml:space="preserve"> </w:t>
+      </w:r>
+      <w:r>
+        <w:rPr>
+          <w:b/>
+          <w:bCs/>
+        </w:rPr>
+        <w:t xml:space="preserve">Amend</w:t>
       </w:r>
     </w:p>
     <w:p>
@@ -4278,15 +4610,7 @@
         <w:noBreakHyphen/>
       </w:r>
       <w:r>
-        <w:t xml:space="preserve">85 (Tenn. Ct. App. 2011) (perm. app. denied Aug. 26, 2011). Nothing prevented Appellants from</w:t>
-      </w:r>
-    </w:p>
-    <w:p>
-      <w:pPr>
-        <w:pStyle w:val="BodyText"/>
-      </w:pPr>
-      <w:r>
-        <w:t xml:space="preserve">pleading the removal of vecuronium bromide as an alternative under Glossip in their initial, first, or second amended complaints.</w:t>
+        <w:t xml:space="preserve">85 (Tenn. Ct. App. 2011) (perm. app. denied Aug. 26, 2011). Nothing prevented Appellants from pleading the removal of vecuronium bromide as an alternative under Glossip in their initial, first, or second amended complaints.</w:t>
       </w:r>
     </w:p>
     <w:p>
@@ -4340,15 +4664,7 @@
         <w:noBreakHyphen/>
       </w:r>
       <w:r>
-        <w:t xml:space="preserve">85. The Chancery Court found that “the issue of removal of Vecuronium Bromide as an alternative protocol under Glossip was not tried by express or implied consent of the parties.” XLV, 1991.</w:t>
-      </w:r>
-    </w:p>
-    <w:p>
-      <w:pPr>
-        <w:pStyle w:val="BodyText"/>
-      </w:pPr>
-      <w:r>
-        <w:t xml:space="preserve">Moreover, the Court found specifically that “[t]he Defendants didn’t have notice that you were saying the alternative is for us to eliminate the Vecuronium Bromide. They had notice that your alternative was Pentobarbital.” XLV, 1965.</w:t>
+        <w:t xml:space="preserve">85. The Chancery Court found that “the issue of removal of Vecuronium Bromide as an alternative protocol under Glossip was not tried by express or implied consent of the parties.” XLV, 1991. Moreover, the Court found specifically that “[t]he Defendants didn’t have notice that you were saying the alternative is for us to eliminate the Vecuronium Bromide. They had notice that your alternative was Pentobarbital.” XLV, 1965.</w:t>
       </w:r>
     </w:p>
     <w:p>
@@ -4364,87 +4680,15 @@
         <w:pStyle w:val="BodyText"/>
       </w:pPr>
       <w:r>
-        <w:t xml:space="preserve">In this case, the Vecuronium Bromide pertains to a number of</w:t>
-      </w:r>
-    </w:p>
-    <w:p>
-      <w:pPr>
-        <w:pStyle w:val="BodyText"/>
-      </w:pPr>
-      <w:r>
-        <w:t xml:space="preserve">causes of action. And now that it’s being asserted as a claim</w:t>
-      </w:r>
-    </w:p>
-    <w:p>
-      <w:pPr>
-        <w:pStyle w:val="BodyText"/>
-      </w:pPr>
-      <w:r>
-        <w:t xml:space="preserve">for an alternative under Glossip alternative feasibility</w:t>
-      </w:r>
-    </w:p>
-    <w:p>
-      <w:pPr>
-        <w:pStyle w:val="BodyText"/>
-      </w:pPr>
-      <w:r>
-        <w:t xml:space="preserve">requirement, I’m just going to call it that, it’s problematic,</w:t>
-      </w:r>
-    </w:p>
-    <w:p>
-      <w:pPr>
-        <w:pStyle w:val="BodyText"/>
-      </w:pPr>
-      <w:r>
-        <w:t xml:space="preserve">because it’s never been viewed that way. The case wasn’t set</w:t>
-      </w:r>
-    </w:p>
-    <w:p>
-      <w:pPr>
-        <w:pStyle w:val="BodyText"/>
-      </w:pPr>
-      <w:r>
-        <w:t xml:space="preserve">up that way. . . . [W]e’ve all looked at the Glossip alternative</w:t>
-      </w:r>
-    </w:p>
-    <w:p>
-      <w:pPr>
-        <w:pStyle w:val="BodyText"/>
-      </w:pPr>
-      <w:r>
-        <w:t xml:space="preserve">as the Plaintiffs alleging Pentobarbital was the alternative.</w:t>
-      </w:r>
-    </w:p>
-    <w:p>
-      <w:pPr>
-        <w:pStyle w:val="BodyText"/>
-      </w:pPr>
-      <w:r>
-        <w:t xml:space="preserve">We’ve known about Vecuronium Bromide, but it hasn’t been</w:t>
-      </w:r>
-    </w:p>
-    <w:p>
-      <w:pPr>
-        <w:pStyle w:val="BodyText"/>
-      </w:pPr>
-      <w:r>
-        <w:t xml:space="preserve">put in the slot of an alternative. So the case was never focused</w:t>
-      </w:r>
-    </w:p>
-    <w:p>
-      <w:pPr>
-        <w:pStyle w:val="BodyText"/>
-      </w:pPr>
-      <w:r>
-        <w:t xml:space="preserve">that way.</w:t>
-      </w:r>
-    </w:p>
-    <w:p>
-      <w:pPr>
-        <w:pStyle w:val="BodyText"/>
-      </w:pPr>
-      <w:r>
-        <w:t xml:space="preserve">XLV, 1963</w:t>
+        <w:t xml:space="preserve">In this case, the Vecuronium Bromide pertains to a number of causes of action. And now that it’s being asserted as a claim for an alternative under Glossip alternative feasibility requirement, I’m just going to call it that, it’s problematic, because it’s never been viewed that way. The case wasn’t set up that way. . . . [W]e’ve all looked at the Glossip alternative as the Plaintiffs alleging Pentobarbital was the alternative.</w:t>
+      </w:r>
+    </w:p>
+    <w:p>
+      <w:pPr>
+        <w:pStyle w:val="BodyText"/>
+      </w:pPr>
+      <w:r>
+        <w:t xml:space="preserve">We’ve known about Vecuronium Bromide, but it hasn’t been put in the slot of an alternative. So the case was never focused that way. XLV, 1963</w:t>
       </w:r>
       <w:r>
         <w:noBreakHyphen/>
@@ -4464,15 +4708,7 @@
         <w:noBreakHyphen/>
       </w:r>
       <w:r>
-        <w:t xml:space="preserve">42 (Tenn. 2013). A court abuses that discretion only if it applies an incorrect legal standard, reaches a conclusion that is not logical, bases its decision on a clearly erroneous assessment of the evidence, or uses</w:t>
-      </w:r>
-    </w:p>
-    <w:p>
-      <w:pPr>
-        <w:pStyle w:val="BodyText"/>
-      </w:pPr>
-      <w:r>
-        <w:t xml:space="preserve">reasoning that causes an injustice to the complaining party. State v. Davidson, 509 S.W.3d 156, 193</w:t>
+        <w:t xml:space="preserve">42 (Tenn. 2013). A court abuses that discretion only if it applies an incorrect legal standard, reaches a conclusion that is not logical, bases its decision on a clearly erroneous assessment of the evidence, or uses reasoning that causes an injustice to the complaining party. State v. Davidson, 509 S.W.3d 156, 193</w:t>
       </w:r>
       <w:r>
         <w:noBreakHyphen/>
@@ -4486,15 +4722,7 @@
         <w:pStyle w:val="BodyText"/>
       </w:pPr>
       <w:r>
-        <w:t xml:space="preserve">Glossip requires that a prisoner “plead and prove a known and available alternative.” 135 S.Ct. at 2739 (emphasis added). Appellants affirmatively pled pentobarbital as their one chosen alternative, and the case was tried on that point. The Chancery Court did not abuse its discretion in denying Appellees’ belated effort to vivify an unproven Eighth Amendment claim.4</w:t>
-      </w:r>
-    </w:p>
-    <w:p>
-      <w:pPr>
-        <w:pStyle w:val="BodyText"/>
-      </w:pPr>
-      <w:r>
-        <w:t xml:space="preserve">III. There Was No “Waiver” of Glossip’s Requirement That</w:t>
+        <w:t xml:space="preserve">Glossip requires that a prisoner “plead and prove a known and available alternative.” 135 S.Ct. at 2739 (emphasis added). Appellants affirmatively pled pentobarbital as their one chosen alternative, and the case was tried on that point. The Chancery Court did not abuse its discretion in denying Appellees’ belated effort to vivify an unproven Eighth Amendment claim.4 III. There Was No “Waiver” of Glossip’s Requirement That</w:t>
       </w:r>
     </w:p>
     <w:p>
@@ -4518,11 +4746,9 @@
         </w:rPr>
         <w:footnoteReference w:id="13"/>
       </w:r>
-    </w:p>
-    <w:p>
-      <w:pPr>
-        <w:pStyle w:val="BodyText"/>
-      </w:pPr>
+      <w:r>
+        <w:t xml:space="preserve"> </w:t>
+      </w:r>
       <w:r>
         <w:t xml:space="preserve">that claim of a “waiver” by Appellees of the Appellants’ burden to prove an essential element their claim. And, in any event, Glossip makes clear that identification and proof of a known and available alternative method of execution is “a requirement of all Eighth Amendment method-of- execution claims.” Glossip, 135 S.Ct. at 2731 (emphasis added).</w:t>
       </w:r>
@@ -4668,13 +4894,75 @@
         </w:rPr>
         <w:t xml:space="preserve">in</w:t>
       </w:r>
-    </w:p>
-    <w:p>
-      <w:pPr>
-        <w:pStyle w:val="BodyText"/>
-      </w:pPr>
-      <w:r>
-        <w:t xml:space="preserve">Denying Appellants’ Request for Discovery.</w:t>
+      <w:r>
+        <w:rPr>
+          <w:b/>
+          <w:bCs/>
+        </w:rPr>
+        <w:t xml:space="preserve"> </w:t>
+      </w:r>
+      <w:r>
+        <w:rPr>
+          <w:b/>
+          <w:bCs/>
+        </w:rPr>
+        <w:t xml:space="preserve">Denying</w:t>
+      </w:r>
+      <w:r>
+        <w:rPr>
+          <w:b/>
+          <w:bCs/>
+        </w:rPr>
+        <w:t xml:space="preserve"> </w:t>
+      </w:r>
+      <w:r>
+        <w:rPr>
+          <w:b/>
+          <w:bCs/>
+        </w:rPr>
+        <w:t xml:space="preserve">Appellants’</w:t>
+      </w:r>
+      <w:r>
+        <w:rPr>
+          <w:b/>
+          <w:bCs/>
+        </w:rPr>
+        <w:t xml:space="preserve"> </w:t>
+      </w:r>
+      <w:r>
+        <w:rPr>
+          <w:b/>
+          <w:bCs/>
+        </w:rPr>
+        <w:t xml:space="preserve">Request</w:t>
+      </w:r>
+      <w:r>
+        <w:rPr>
+          <w:b/>
+          <w:bCs/>
+        </w:rPr>
+        <w:t xml:space="preserve"> </w:t>
+      </w:r>
+      <w:r>
+        <w:rPr>
+          <w:b/>
+          <w:bCs/>
+        </w:rPr>
+        <w:t xml:space="preserve">for</w:t>
+      </w:r>
+      <w:r>
+        <w:rPr>
+          <w:b/>
+          <w:bCs/>
+        </w:rPr>
+        <w:t xml:space="preserve"> </w:t>
+      </w:r>
+      <w:r>
+        <w:rPr>
+          <w:b/>
+          <w:bCs/>
+        </w:rPr>
+        <w:t xml:space="preserve">Discovery.</w:t>
       </w:r>
     </w:p>
     <w:p>
@@ -4698,15 +4986,7 @@
         <w:pStyle w:val="BodyText"/>
       </w:pPr>
       <w:r>
-        <w:t xml:space="preserve">The “basic positive touchstone” for the permissible scope of discovery is relevance. Johnson v. Nissan North America, Inc., 146 S.W.3d 600, 605 (Tenn. Ct. App. 2004); see also West I, 460 S.W.3d at 125. To be discoverable under Rule 26.02(1), a matter must be “relevant to the subject matter involved in the pending action.” Tenn. R. Civ. P. 26.02(1). Relevant evidence is defined as “evidence having any tendency to make the existence of any fact that is of consequence to the determination of</w:t>
-      </w:r>
-    </w:p>
-    <w:p>
-      <w:pPr>
-        <w:pStyle w:val="BodyText"/>
-      </w:pPr>
-      <w:r>
-        <w:t xml:space="preserve">the action more probable or less probable that it would be without the evidence.” Tenn. R. Evid. 401. Information sought by a plaintiff “must have some logical connection to proving his case and/​or obtaining his prayed-for relief.” West I, 460 S.W.3d at 125. Thus, the “crucial issue” in assessing the discoverability of information under Rule 26 is to determine what is included in “the subject matter involved in the pending action.” Id.</w:t>
+        <w:t xml:space="preserve">The “basic positive touchstone” for the permissible scope of discovery is relevance. Johnson v. Nissan North America, Inc., 146 S.W.3d 600, 605 (Tenn. Ct. App. 2004); see also West I, 460 S.W.3d at 125. To be discoverable under Rule 26.02(1), a matter must be “relevant to the subject matter involved in the pending action.” Tenn. R. Civ. P. 26.02(1). Relevant evidence is defined as “evidence having any tendency to make the existence of any fact that is of consequence to the determination of the action more probable or less probable that it would be without the evidence.” Tenn. R. Evid. 401. Information sought by a plaintiff “must have some logical connection to proving his case and/​or obtaining his prayed-for relief.” West I, 460 S.W.3d at 125. Thus, the “crucial issue” in assessing the discoverability of information under Rule 26 is to determine what is included in “the subject matter involved in the pending action.” Id.</w:t>
       </w:r>
     </w:p>
     <w:p>
@@ -4758,15 +5038,7 @@
         <w:pStyle w:val="BodyText"/>
       </w:pPr>
       <w:r>
-        <w:t xml:space="preserve">None of these rulings “restrict[ed]” the Appellants from investigating or presenting evidence on the availability of pentobarbital. them from presenting evidence from their own witnesses about the availability of the drug. But, despite marshaling four “eminent,” “world- class experts,” id. at 9, 124, and 185 n.49, in the medical and pharmacological fields, Appellants presented “none of their own witnesses to show that their proposed method of execution— pentobarbital—is available to the State.” XVI, 2239. In fact, the testimony of Appellants’ experts revealed that Appellants did not even</w:t>
-      </w:r>
-    </w:p>
-    <w:p>
-      <w:pPr>
-        <w:pStyle w:val="BodyText"/>
-      </w:pPr>
-      <w:r>
-        <w:t xml:space="preserve">request that information from them. XXV, 169 (Stevens), XXVIII, 550</w:t>
+        <w:t xml:space="preserve">None of these rulings “restrict[ed]” the Appellants from investigating or presenting evidence on the availability of pentobarbital. them from presenting evidence from their own witnesses about the availability of the drug. But, despite marshaling four “eminent,” “world- class experts,” id. at 9, 124, and 185 n.49, in the medical and pharmacological fields, Appellants presented “none of their own witnesses to show that their proposed method of execution— pentobarbital—is available to the State.” XVI, 2239. In fact, the testimony of Appellants’ experts revealed that Appellants did not even request that information from them. XXV, 169 (Stevens), XXVIII, 550</w:t>
       </w:r>
       <w:r>
         <w:noBreakHyphen/>
@@ -4802,15 +5074,7 @@
         <w:pStyle w:val="BodyText"/>
       </w:pPr>
       <w:r>
-        <w:t xml:space="preserve">This issue is meritless.</w:t>
-      </w:r>
-    </w:p>
-    <w:p>
-      <w:pPr>
-        <w:pStyle w:val="BodyText"/>
-      </w:pPr>
-      <w:r>
-        <w:t xml:space="preserve">5 In fact, logic and common sense dictate that, had Appellants located a source for their preferred alternative, the Department would have gone to that source to obtain the pentobarbital. As Commissioner Parker testified, “if the Department had a source of Pentobarbital, it would be used.” XXXVII, 1355.</w:t>
+        <w:t xml:space="preserve">This issue is meritless. 5 In fact, logic and common sense dictate that, had Appellants located a source for their preferred alternative, the Department would have gone to that source to obtain the pentobarbital. As Commissioner Parker testified, “if the Department had a source of Pentobarbital, it would be used.” XXXVII, 1355.</w:t>
       </w:r>
     </w:p>
     <w:p>
@@ -4912,21 +5176,243 @@
         </w:rPr>
         <w:t xml:space="preserve">Identities</w:t>
       </w:r>
-    </w:p>
-    <w:p>
-      <w:pPr>
-        <w:pStyle w:val="BodyText"/>
-      </w:pPr>
-      <w:r>
-        <w:t xml:space="preserve">of Individuals Involved in the Execution Process Do Not</w:t>
-      </w:r>
-    </w:p>
-    <w:p>
-      <w:pPr>
-        <w:pStyle w:val="BodyText"/>
-      </w:pPr>
-      <w:r>
-        <w:t xml:space="preserve">Excuse Appellants from Proving the Essential Elements of</w:t>
+      <w:r>
+        <w:rPr>
+          <w:b/>
+          <w:bCs/>
+        </w:rPr>
+        <w:t xml:space="preserve"> </w:t>
+      </w:r>
+      <w:r>
+        <w:rPr>
+          <w:b/>
+          <w:bCs/>
+        </w:rPr>
+        <w:t xml:space="preserve">of</w:t>
+      </w:r>
+      <w:r>
+        <w:rPr>
+          <w:b/>
+          <w:bCs/>
+        </w:rPr>
+        <w:t xml:space="preserve"> </w:t>
+      </w:r>
+      <w:r>
+        <w:rPr>
+          <w:b/>
+          <w:bCs/>
+        </w:rPr>
+        <w:t xml:space="preserve">Individuals</w:t>
+      </w:r>
+      <w:r>
+        <w:rPr>
+          <w:b/>
+          <w:bCs/>
+        </w:rPr>
+        <w:t xml:space="preserve"> </w:t>
+      </w:r>
+      <w:r>
+        <w:rPr>
+          <w:b/>
+          <w:bCs/>
+        </w:rPr>
+        <w:t xml:space="preserve">Involved</w:t>
+      </w:r>
+      <w:r>
+        <w:rPr>
+          <w:b/>
+          <w:bCs/>
+        </w:rPr>
+        <w:t xml:space="preserve"> </w:t>
+      </w:r>
+      <w:r>
+        <w:rPr>
+          <w:b/>
+          <w:bCs/>
+        </w:rPr>
+        <w:t xml:space="preserve">in</w:t>
+      </w:r>
+      <w:r>
+        <w:rPr>
+          <w:b/>
+          <w:bCs/>
+        </w:rPr>
+        <w:t xml:space="preserve"> </w:t>
+      </w:r>
+      <w:r>
+        <w:rPr>
+          <w:b/>
+          <w:bCs/>
+        </w:rPr>
+        <w:t xml:space="preserve">the</w:t>
+      </w:r>
+      <w:r>
+        <w:rPr>
+          <w:b/>
+          <w:bCs/>
+        </w:rPr>
+        <w:t xml:space="preserve"> </w:t>
+      </w:r>
+      <w:r>
+        <w:rPr>
+          <w:b/>
+          <w:bCs/>
+        </w:rPr>
+        <w:t xml:space="preserve">Execution</w:t>
+      </w:r>
+      <w:r>
+        <w:rPr>
+          <w:b/>
+          <w:bCs/>
+        </w:rPr>
+        <w:t xml:space="preserve"> </w:t>
+      </w:r>
+      <w:r>
+        <w:rPr>
+          <w:b/>
+          <w:bCs/>
+        </w:rPr>
+        <w:t xml:space="preserve">Process</w:t>
+      </w:r>
+      <w:r>
+        <w:rPr>
+          <w:b/>
+          <w:bCs/>
+        </w:rPr>
+        <w:t xml:space="preserve"> </w:t>
+      </w:r>
+      <w:r>
+        <w:rPr>
+          <w:b/>
+          <w:bCs/>
+        </w:rPr>
+        <w:t xml:space="preserve">Do</w:t>
+      </w:r>
+      <w:r>
+        <w:rPr>
+          <w:b/>
+          <w:bCs/>
+        </w:rPr>
+        <w:t xml:space="preserve"> </w:t>
+      </w:r>
+      <w:r>
+        <w:rPr>
+          <w:b/>
+          <w:bCs/>
+        </w:rPr>
+        <w:t xml:space="preserve">Not</w:t>
+      </w:r>
+      <w:r>
+        <w:rPr>
+          <w:b/>
+          <w:bCs/>
+        </w:rPr>
+        <w:t xml:space="preserve"> </w:t>
+      </w:r>
+      <w:r>
+        <w:rPr>
+          <w:b/>
+          <w:bCs/>
+        </w:rPr>
+        <w:t xml:space="preserve">Excuse</w:t>
+      </w:r>
+      <w:r>
+        <w:rPr>
+          <w:b/>
+          <w:bCs/>
+        </w:rPr>
+        <w:t xml:space="preserve"> </w:t>
+      </w:r>
+      <w:r>
+        <w:rPr>
+          <w:b/>
+          <w:bCs/>
+        </w:rPr>
+        <w:t xml:space="preserve">Appellants</w:t>
+      </w:r>
+      <w:r>
+        <w:rPr>
+          <w:b/>
+          <w:bCs/>
+        </w:rPr>
+        <w:t xml:space="preserve"> </w:t>
+      </w:r>
+      <w:r>
+        <w:rPr>
+          <w:b/>
+          <w:bCs/>
+        </w:rPr>
+        <w:t xml:space="preserve">from</w:t>
+      </w:r>
+      <w:r>
+        <w:rPr>
+          <w:b/>
+          <w:bCs/>
+        </w:rPr>
+        <w:t xml:space="preserve"> </w:t>
+      </w:r>
+      <w:r>
+        <w:rPr>
+          <w:b/>
+          <w:bCs/>
+        </w:rPr>
+        <w:t xml:space="preserve">Proving</w:t>
+      </w:r>
+      <w:r>
+        <w:rPr>
+          <w:b/>
+          <w:bCs/>
+        </w:rPr>
+        <w:t xml:space="preserve"> </w:t>
+      </w:r>
+      <w:r>
+        <w:rPr>
+          <w:b/>
+          <w:bCs/>
+        </w:rPr>
+        <w:t xml:space="preserve">the</w:t>
+      </w:r>
+      <w:r>
+        <w:rPr>
+          <w:b/>
+          <w:bCs/>
+        </w:rPr>
+        <w:t xml:space="preserve"> </w:t>
+      </w:r>
+      <w:r>
+        <w:rPr>
+          <w:b/>
+          <w:bCs/>
+        </w:rPr>
+        <w:t xml:space="preserve">Essential</w:t>
+      </w:r>
+      <w:r>
+        <w:rPr>
+          <w:b/>
+          <w:bCs/>
+        </w:rPr>
+        <w:t xml:space="preserve"> </w:t>
+      </w:r>
+      <w:r>
+        <w:rPr>
+          <w:b/>
+          <w:bCs/>
+        </w:rPr>
+        <w:t xml:space="preserve">Elements</w:t>
+      </w:r>
+      <w:r>
+        <w:rPr>
+          <w:b/>
+          <w:bCs/>
+        </w:rPr>
+        <w:t xml:space="preserve"> </w:t>
+      </w:r>
+      <w:r>
+        <w:rPr>
+          <w:b/>
+          <w:bCs/>
+        </w:rPr>
+        <w:t xml:space="preserve">of</w:t>
       </w:r>
     </w:p>
     <w:p>
@@ -5086,15 +5572,7 @@
         <w:pStyle w:val="BodyText"/>
       </w:pPr>
       <w:r>
-        <w:t xml:space="preserve">The right of access to the courts is a component of the First Amendment right to petition the government for redress of grievances. See Bill Johnson’s Rests., Inc. v. NLRB, 461 U.S. 731, 741 (1983). But there can be no deprivation of that right without a relevant actual injury. See Lewis v. Casey, 518 U.S. 343, 351 (1996) (explaining, by way of comparison, that a healthy inmate cannot claim a constitutional violation because of the inadequacy of the prison infirmary). And “the injury requirement is not satisfied by just any type of frustrated legal claim.” Lewis, 518 U.S. at 354. To have meaningful access to courts, inmates</w:t>
-      </w:r>
-    </w:p>
-    <w:p>
-      <w:pPr>
-        <w:pStyle w:val="BodyText"/>
-      </w:pPr>
-      <w:r>
-        <w:t xml:space="preserve">need only be given the tools necessary to attack their sentences. “Impairment of any other litigating capacity is simply one of the incidental (and perfectly constitutional) consequences of conviction and incarceration.” Id. at 355.</w:t>
+        <w:t xml:space="preserve">The right of access to the courts is a component of the First Amendment right to petition the government for redress of grievances. See Bill Johnson’s Rests., Inc. v. NLRB, 461 U.S. 731, 741 (1983). But there can be no deprivation of that right without a relevant actual injury. See Lewis v. Casey, 518 U.S. 343, 351 (1996) (explaining, by way of comparison, that a healthy inmate cannot claim a constitutional violation because of the inadequacy of the prison infirmary). And “the injury requirement is not satisfied by just any type of frustrated legal claim.” Lewis, 518 U.S. at 354. To have meaningful access to courts, inmates need only be given the tools necessary to attack their sentences. “Impairment of any other litigating capacity is simply one of the incidental (and perfectly constitutional) consequences of conviction and incarceration.” Id. at 355.</w:t>
       </w:r>
     </w:p>
     <w:p>
@@ -5118,31 +5596,15 @@
         <w:pStyle w:val="BodyText"/>
       </w:pPr>
       <w:r>
-        <w:t xml:space="preserve">The Chancery Court correctly dismissed this claim.</w:t>
-      </w:r>
-    </w:p>
-    <w:p>
-      <w:pPr>
-        <w:pStyle w:val="BodyText"/>
-      </w:pPr>
-      <w:r>
-        <w:t xml:space="preserve">VII. The Lethal Injection Protocol Does Not Violate Substantive</w:t>
-      </w:r>
-    </w:p>
-    <w:p>
-      <w:pPr>
-        <w:pStyle w:val="BodyText"/>
-      </w:pPr>
-      <w:r>
-        <w:t xml:space="preserve">Appellants contend that the Department’s promulgation of the lethal injection protocol to include midazolam as the first drug in the three-drug protocol violates substantive due process guarantees of the</w:t>
-      </w:r>
-    </w:p>
-    <w:p>
-      <w:pPr>
-        <w:pStyle w:val="BodyText"/>
-      </w:pPr>
-      <w:r>
-        <w:t xml:space="preserve">They insist that this claim “does not challenge the use of Midazolam” but only the “process” by which it was selected. Id. at 282 (emphasis in original). The Chancery Court correctly dismissed this claim.</w:t>
+        <w:t xml:space="preserve">The Chancery Court correctly dismissed this claim. VII. The Lethal Injection Protocol Does Not Violate Substantive</w:t>
+      </w:r>
+    </w:p>
+    <w:p>
+      <w:pPr>
+        <w:pStyle w:val="BodyText"/>
+      </w:pPr>
+      <w:r>
+        <w:t xml:space="preserve">Appellants contend that the Department’s promulgation of the lethal injection protocol to include midazolam as the first drug in the three-drug protocol violates substantive due process guarantees of the They insist that this claim “does not challenge the use of Midazolam” but only the “process” by which it was selected. Id. at 282 (emphasis in original). The Chancery Court correctly dismissed this claim.</w:t>
       </w:r>
     </w:p>
     <w:p>
@@ -5178,15 +5640,7 @@
         <w:pStyle w:val="BodyText"/>
       </w:pPr>
       <w:r>
-        <w:t xml:space="preserve">The General Assembly has selected lethal injection to be the primary method of execution in Tennessee. Tenn. Code Ann. § 40-⁠23-⁠114(a). Concomitant with that selection, the General Assembly gave the Department of Correction broad statutory authority to implement this policy. Tenn. Code Ann. § 40-⁠23-⁠114(c). There is surely nothing shocking</w:t>
-      </w:r>
-    </w:p>
-    <w:p>
-      <w:pPr>
-        <w:pStyle w:val="BodyText"/>
-      </w:pPr>
-      <w:r>
-        <w:t xml:space="preserve">about a decision to adopt a method of execution approved by the United States Supreme Court and implemented more than 17 times by various States since that decision. Glossip, 135 S.Ct. at 2739</w:t>
+        <w:t xml:space="preserve">The General Assembly has selected lethal injection to be the primary method of execution in Tennessee. Tenn. Code Ann. § 40-⁠23-⁠114(a). Concomitant with that selection, the General Assembly gave the Department of Correction broad statutory authority to implement this policy. Tenn. Code Ann. § 40-⁠23-⁠114(c). There is surely nothing shocking about a decision to adopt a method of execution approved by the United States Supreme Court and implemented more than 17 times by various States since that decision. Glossip, 135 S.Ct. at 2739</w:t>
       </w:r>
       <w:r>
         <w:noBreakHyphen/>
@@ -5208,135 +5662,31 @@
         <w:pStyle w:val="BodyText"/>
       </w:pPr>
       <w:r>
-        <w:t xml:space="preserve">[T]here is nothing arbitrary, irrational, improper or egregious</w:t>
-      </w:r>
-    </w:p>
-    <w:p>
-      <w:pPr>
-        <w:pStyle w:val="BodyText"/>
-      </w:pPr>
-      <w:r>
-        <w:t xml:space="preserve">in the Department of Correction following the legislative</w:t>
-      </w:r>
-    </w:p>
-    <w:p>
-      <w:pPr>
-        <w:pStyle w:val="BodyText"/>
-      </w:pPr>
-      <w:r>
-        <w:t xml:space="preserve">mandate to implement lethal injection as a method of</w:t>
-      </w:r>
-    </w:p>
-    <w:p>
-      <w:pPr>
-        <w:pStyle w:val="BodyText"/>
-      </w:pPr>
-      <w:r>
-        <w:t xml:space="preserve">punishment. Second, there is nothing arbitrary, irrational,</w:t>
-      </w:r>
-    </w:p>
-    <w:p>
-      <w:pPr>
-        <w:pStyle w:val="BodyText"/>
-      </w:pPr>
-      <w:r>
-        <w:t xml:space="preserve">improper or egregious in the manner in which the</w:t>
-      </w:r>
-    </w:p>
-    <w:p>
-      <w:pPr>
-        <w:pStyle w:val="BodyText"/>
-      </w:pPr>
-      <w:r>
-        <w:t xml:space="preserve">Department implemented a lethal injection protocol, i.e., by</w:t>
-      </w:r>
-    </w:p>
-    <w:p>
-      <w:pPr>
-        <w:pStyle w:val="BodyText"/>
-      </w:pPr>
-      <w:r>
-        <w:t xml:space="preserve">studying the lethal injection protocols of other states and the</w:t>
-      </w:r>
-    </w:p>
-    <w:p>
-      <w:pPr>
-        <w:pStyle w:val="BodyText"/>
-      </w:pPr>
-      <w:r>
-        <w:t xml:space="preserve">federal government and by using those protocols as models for</w:t>
-      </w:r>
-    </w:p>
-    <w:p>
-      <w:pPr>
-        <w:pStyle w:val="BodyText"/>
-      </w:pPr>
-      <w:r>
-        <w:t xml:space="preserve">the creation of Tennessee’s protocol. Finally, as fully</w:t>
-      </w:r>
-    </w:p>
-    <w:p>
-      <w:pPr>
-        <w:pStyle w:val="BodyText"/>
-      </w:pPr>
-      <w:r>
-        <w:t xml:space="preserve">explained in our analysis of the cruel and unusual</w:t>
-      </w:r>
-    </w:p>
-    <w:p>
-      <w:pPr>
-        <w:pStyle w:val="BodyText"/>
-      </w:pPr>
-      <w:r>
-        <w:t xml:space="preserve">punishment issue, there is no evidence that the Tennessee</w:t>
-      </w:r>
-    </w:p>
-    <w:p>
-      <w:pPr>
-        <w:pStyle w:val="BodyText"/>
-      </w:pPr>
-      <w:r>
-        <w:t xml:space="preserve">lethal injection protocol creates an unreasonable risk of</w:t>
-      </w:r>
-    </w:p>
-    <w:p>
-      <w:pPr>
-        <w:pStyle w:val="BodyText"/>
-      </w:pPr>
-      <w:r>
-        <w:t xml:space="preserve">unnecessary pain and suffering.</w:t>
-      </w:r>
-    </w:p>
-    <w:p>
-      <w:pPr>
-        <w:pStyle w:val="BodyText"/>
-      </w:pPr>
-      <w:r>
-        <w:t xml:space="preserve">Moreover, when “a particular Amendment provides an explicit textual source of constitutional protection against a particular sort of government behavior, that Amendment, not the more generalized notion of substantive due process, must be the guide for analyzing the claims.” Partin v. Davis, 675 Fed. Appx. 575, 581, 2017 WL 128559 (6th Cir. 2017) (quoting County of Sacramento, 523 U.S. at 842). The Chancery Court correctly recognized that the Eighth Amendment is an explicit textual source of constitutional protection on the Appellants’ claim challenging the State’s implementation of a death sentence. XVI, 2264. Accordingly, that Amendment, not the more generalized notion of substantive due</w:t>
-      </w:r>
-    </w:p>
-    <w:p>
-      <w:pPr>
-        <w:pStyle w:val="BodyText"/>
-      </w:pPr>
-      <w:r>
-        <w:t xml:space="preserve">process, provides the appropriate analytical framework for Appellants’ claims. And as demonstrated above, Tennessee’s lethal injection protocol satisfies Eighth Amendment requirements.</w:t>
-      </w:r>
-    </w:p>
-    <w:p>
-      <w:pPr>
-        <w:pStyle w:val="BodyText"/>
-      </w:pPr>
-      <w:r>
-        <w:t xml:space="preserve">Appellants’ claim that the process by which the Department chose to use a constitutional method of execution shocks the conscience is meritless.</w:t>
-      </w:r>
-    </w:p>
-    <w:p>
-      <w:pPr>
-        <w:pStyle w:val="BodyText"/>
-      </w:pPr>
-      <w:r>
-        <w:t xml:space="preserve">VIII. The Lethal Injection Protocol Does Not Violate Appellants’</w:t>
+        <w:t xml:space="preserve">[T]here is nothing arbitrary, irrational, improper or egregious in the Department of Correction following the legislative mandate to implement lethal injection as a method of punishment. Second, there is nothing arbitrary, irrational, improper or egregious in the manner in which the</w:t>
+      </w:r>
+    </w:p>
+    <w:p>
+      <w:pPr>
+        <w:pStyle w:val="BodyText"/>
+      </w:pPr>
+      <w:r>
+        <w:t xml:space="preserve">Department implemented a lethal injection protocol, i.e., by studying the lethal injection protocols of other states and the federal government and by using those protocols as models for the creation of Tennessee’s protocol. Finally, as fully explained in our analysis of the cruel and unusual punishment issue, there is no evidence that the Tennessee lethal injection protocol creates an unreasonable risk of unnecessary pain and suffering.</w:t>
+      </w:r>
+    </w:p>
+    <w:p>
+      <w:pPr>
+        <w:pStyle w:val="BodyText"/>
+      </w:pPr>
+      <w:r>
+        <w:t xml:space="preserve">Moreover, when “a particular Amendment provides an explicit textual source of constitutional protection against a particular sort of government behavior, that Amendment, not the more generalized notion of substantive due process, must be the guide for analyzing the claims.” Partin v. Davis, 675 Fed. Appx. 575, 581, 2017 WL 128559 (6th Cir. 2017) (quoting County of Sacramento, 523 U.S. at 842). The Chancery Court correctly recognized that the Eighth Amendment is an explicit textual source of constitutional protection on the Appellants’ claim challenging the State’s implementation of a death sentence. XVI, 2264. Accordingly, that Amendment, not the more generalized notion of substantive due process, provides the appropriate analytical framework for Appellants’ claims. And as demonstrated above, Tennessee’s lethal injection protocol satisfies Eighth Amendment requirements.</w:t>
+      </w:r>
+    </w:p>
+    <w:p>
+      <w:pPr>
+        <w:pStyle w:val="BodyText"/>
+      </w:pPr>
+      <w:r>
+        <w:t xml:space="preserve">Appellants’ claim that the process by which the Department chose to use a constitutional method of execution shocks the conscience is meritless. VIII. The Lethal Injection Protocol Does Not Violate Appellants’</w:t>
       </w:r>
     </w:p>
     <w:p>
@@ -5364,15 +5714,7 @@
         <w:noBreakHyphen/>
       </w:r>
       <w:r>
-        <w:t xml:space="preserve">73 (1976) (quoting Trop v. Dulles, 356 U.S. 86, 101 (1958)). A penalty must also accord with “the dignity of man.” Id. The Supreme Court explained that this means, at least, that a punishment may not be “excessive,” which is understood in two aspects: first, the punishment must not involve the unnecessary and wanton infliction of pain; and second, the punishment must not be grossly out of proportion to the severity of the crime. Id.</w:t>
-      </w:r>
-    </w:p>
-    <w:p>
-      <w:pPr>
-        <w:pStyle w:val="BodyText"/>
-      </w:pPr>
-      <w:r>
-        <w:t xml:space="preserve">But those considerations provide no independent basis for an Eighth Amendment method-of-execution claim because they are already encompassed within the Baze/​Glossip analysis, which governs when assessing whether a particular method of execution is forbidden. Baze, 553 U.S. at 48</w:t>
+        <w:t xml:space="preserve">73 (1976) (quoting Trop v. Dulles, 356 U.S. 86, 101 (1958)). A penalty must also accord with “the dignity of man.” Id. The Supreme Court explained that this means, at least, that a punishment may not be “excessive,” which is understood in two aspects: first, the punishment must not involve the unnecessary and wanton infliction of pain; and second, the punishment must not be grossly out of proportion to the severity of the crime. Id. But those considerations provide no independent basis for an Eighth Amendment method-of-execution claim because they are already encompassed within the Baze/​Glossip analysis, which governs when assessing whether a particular method of execution is forbidden. Baze, 553 U.S. at 48</w:t>
       </w:r>
       <w:r>
         <w:noBreakHyphen/>
@@ -5406,15 +5748,7 @@
         <w:noBreakHyphen/>
       </w:r>
       <w:r>
-        <w:t xml:space="preserve">39 (quoting Baze v. Rees, 553 U.S. 35, 50, 52 (2008)). Since Appellants did not and cannot prevail on that claim, the Chancery Court correctly dismissed their claim that the lethal injection protocol violates “evolving standards of decency.”</w:t>
-      </w:r>
-    </w:p>
-    <w:p>
-      <w:pPr>
-        <w:pStyle w:val="BodyText"/>
-      </w:pPr>
-      <w:r>
-        <w:t xml:space="preserve">6 governing cases, requires no different result. And to the extent the Eighth Amendment analysis in that case is different or inconsistent with Baze/​Glossip, it has been superseded.</w:t>
+        <w:t xml:space="preserve">39 (quoting Baze v. Rees, 553 U.S. 35, 50, 52 (2008)). Since Appellants did not and cannot prevail on that claim, the Chancery Court correctly dismissed their claim that the lethal injection protocol violates “evolving standards of decency.” 6 governing cases, requires no different result. And to the extent the Eighth Amendment analysis in that case is different or inconsistent with Baze/​Glossip, it has been superseded.</w:t>
       </w:r>
     </w:p>
     <w:p>
@@ -5544,13 +5878,103 @@
         </w:rPr>
         <w:t xml:space="preserve">Appellants’</w:t>
       </w:r>
-    </w:p>
-    <w:p>
-      <w:pPr>
-        <w:pStyle w:val="BodyText"/>
-      </w:pPr>
-      <w:r>
-        <w:t xml:space="preserve">Constitutional Rights by Using Chemicals Prohibited for</w:t>
+      <w:r>
+        <w:rPr>
+          <w:b/>
+          <w:bCs/>
+        </w:rPr>
+        <w:t xml:space="preserve"> </w:t>
+      </w:r>
+      <w:r>
+        <w:rPr>
+          <w:b/>
+          <w:bCs/>
+        </w:rPr>
+        <w:t xml:space="preserve">Constitutional</w:t>
+      </w:r>
+      <w:r>
+        <w:rPr>
+          <w:b/>
+          <w:bCs/>
+        </w:rPr>
+        <w:t xml:space="preserve"> </w:t>
+      </w:r>
+      <w:r>
+        <w:rPr>
+          <w:b/>
+          <w:bCs/>
+        </w:rPr>
+        <w:t xml:space="preserve">Rights</w:t>
+      </w:r>
+      <w:r>
+        <w:rPr>
+          <w:b/>
+          <w:bCs/>
+        </w:rPr>
+        <w:t xml:space="preserve"> </w:t>
+      </w:r>
+      <w:r>
+        <w:rPr>
+          <w:b/>
+          <w:bCs/>
+        </w:rPr>
+        <w:t xml:space="preserve">by</w:t>
+      </w:r>
+      <w:r>
+        <w:rPr>
+          <w:b/>
+          <w:bCs/>
+        </w:rPr>
+        <w:t xml:space="preserve"> </w:t>
+      </w:r>
+      <w:r>
+        <w:rPr>
+          <w:b/>
+          <w:bCs/>
+        </w:rPr>
+        <w:t xml:space="preserve">Using</w:t>
+      </w:r>
+      <w:r>
+        <w:rPr>
+          <w:b/>
+          <w:bCs/>
+        </w:rPr>
+        <w:t xml:space="preserve"> </w:t>
+      </w:r>
+      <w:r>
+        <w:rPr>
+          <w:b/>
+          <w:bCs/>
+        </w:rPr>
+        <w:t xml:space="preserve">Chemicals</w:t>
+      </w:r>
+      <w:r>
+        <w:rPr>
+          <w:b/>
+          <w:bCs/>
+        </w:rPr>
+        <w:t xml:space="preserve"> </w:t>
+      </w:r>
+      <w:r>
+        <w:rPr>
+          <w:b/>
+          <w:bCs/>
+        </w:rPr>
+        <w:t xml:space="preserve">Prohibited</w:t>
+      </w:r>
+      <w:r>
+        <w:rPr>
+          <w:b/>
+          <w:bCs/>
+        </w:rPr>
+        <w:t xml:space="preserve"> </w:t>
+      </w:r>
+      <w:r>
+        <w:rPr>
+          <w:b/>
+          <w:bCs/>
+        </w:rPr>
+        <w:t xml:space="preserve">for</w:t>
       </w:r>
     </w:p>
     <w:p>
@@ -5604,95 +6028,23 @@
         <w:pStyle w:val="BodyText"/>
       </w:pPr>
       <w:r>
-        <w:t xml:space="preserve">Act for numerous reasons. The plain language of the Act is</w:t>
-      </w:r>
-    </w:p>
-    <w:p>
-      <w:pPr>
-        <w:pStyle w:val="BodyText"/>
-      </w:pPr>
-      <w:r>
-        <w:t xml:space="preserve">applicable only to certain public and private agencies set out</w:t>
-      </w:r>
-    </w:p>
-    <w:p>
-      <w:pPr>
-        <w:pStyle w:val="BodyText"/>
-      </w:pPr>
-      <w:r>
-        <w:t xml:space="preserve">in section 44–17–302, which group does not include the</w:t>
-      </w:r>
-    </w:p>
-    <w:p>
-      <w:pPr>
-        <w:pStyle w:val="BodyText"/>
-      </w:pPr>
-      <w:r>
-        <w:t xml:space="preserve">Department of Correction. The plain language in the</w:t>
-      </w:r>
-    </w:p>
-    <w:p>
-      <w:pPr>
-        <w:pStyle w:val="BodyText"/>
-      </w:pPr>
-      <w:r>
-        <w:t xml:space="preserve">statutory definition of a nonlivestock animal as provided in</w:t>
-      </w:r>
-    </w:p>
-    <w:p>
-      <w:pPr>
-        <w:pStyle w:val="BodyText"/>
-      </w:pPr>
-      <w:r>
-        <w:t xml:space="preserve">section 39–14–201(3) does not include human beings.</w:t>
-      </w:r>
-    </w:p>
-    <w:p>
-      <w:pPr>
-        <w:pStyle w:val="BodyText"/>
-      </w:pPr>
-      <w:r>
-        <w:t xml:space="preserve">Likewise, there is no language in the Act or elsewhere that</w:t>
-      </w:r>
-    </w:p>
-    <w:p>
-      <w:pPr>
-        <w:pStyle w:val="BodyText"/>
-      </w:pPr>
-      <w:r>
-        <w:t xml:space="preserve">plainly states or otherwise suggests its applicability to</w:t>
-      </w:r>
-    </w:p>
-    <w:p>
-      <w:pPr>
-        <w:pStyle w:val="BodyText"/>
-      </w:pPr>
-      <w:r>
-        <w:t xml:space="preserve">inmates in the Department of Correction. Finally, there is no</w:t>
-      </w:r>
-    </w:p>
-    <w:p>
-      <w:pPr>
-        <w:pStyle w:val="BodyText"/>
-      </w:pPr>
-      <w:r>
-        <w:t xml:space="preserve">language in the lethal injection statute or elsewhere that</w:t>
-      </w:r>
-    </w:p>
-    <w:p>
-      <w:pPr>
-        <w:pStyle w:val="BodyText"/>
-      </w:pPr>
-      <w:r>
-        <w:t xml:space="preserve">would indicate it is to be construed or interpreted in</w:t>
-      </w:r>
-    </w:p>
-    <w:p>
-      <w:pPr>
-        <w:pStyle w:val="BodyText"/>
-      </w:pPr>
-      <w:r>
-        <w:t xml:space="preserve">conjunction with the Nonlivestock Animal Humane Death</w:t>
+        <w:t xml:space="preserve">Act for numerous reasons. The plain language of the Act is applicable only to certain public and private agencies set out in section 44–17–302, which group does not include the</w:t>
+      </w:r>
+    </w:p>
+    <w:p>
+      <w:pPr>
+        <w:pStyle w:val="BodyText"/>
+      </w:pPr>
+      <w:r>
+        <w:t xml:space="preserve">Department of Correction. The plain language in the statutory definition of a nonlivestock animal as provided in section 39–14–201(3) does not include human beings.</w:t>
+      </w:r>
+    </w:p>
+    <w:p>
+      <w:pPr>
+        <w:pStyle w:val="BodyText"/>
+      </w:pPr>
+      <w:r>
+        <w:t xml:space="preserve">Likewise, there is no language in the Act or elsewhere that plainly states or otherwise suggests its applicability to inmates in the Department of Correction. Finally, there is no language in the lethal injection statute or elsewhere that would indicate it is to be construed or interpreted in conjunction with the Nonlivestock Animal Humane Death</w:t>
       </w:r>
     </w:p>
     <w:p>
@@ -5852,45 +6204,321 @@
         </w:rPr>
         <w:t xml:space="preserve">in</w:t>
       </w:r>
-    </w:p>
-    <w:p>
-      <w:pPr>
-        <w:pStyle w:val="BodyText"/>
-      </w:pPr>
-      <w:r>
-        <w:t xml:space="preserve">Denying Appellants’ Eleventh-Hour Request to Add an As-</w:t>
-      </w:r>
-    </w:p>
-    <w:p>
-      <w:pPr>
-        <w:pStyle w:val="BodyText"/>
-      </w:pPr>
-      <w:r>
-        <w:t xml:space="preserve">Applied Challenge Regarding the Credentials and</w:t>
-      </w:r>
-    </w:p>
-    <w:p>
-      <w:pPr>
-        <w:pStyle w:val="BodyText"/>
-      </w:pPr>
-      <w:r>
-        <w:t xml:space="preserve">Qualifications of the State’s Source of Lethal Injection</w:t>
-      </w:r>
-    </w:p>
-    <w:p>
-      <w:pPr>
-        <w:pStyle w:val="BodyText"/>
-      </w:pPr>
-      <w:r>
-        <w:t xml:space="preserve">Appellants contend that the Chancery Court abused its discretion in denying their motion to raise an as-applied challenge to the qualifications of the Department’s drug supplier/​compounder. on June 28, 2018, just eleven days before the start of trial. TR X, 1275.</w:t>
-      </w:r>
-    </w:p>
-    <w:p>
-      <w:pPr>
-        <w:pStyle w:val="BodyText"/>
-      </w:pPr>
-      <w:r>
-        <w:t xml:space="preserve">A court abuses its discretion only if it applies an incorrect legal standard, reaches a conclusion that is not logical, bases its decision on a clearly erroneous assessment of the evidence, or uses reasoning that causes an injustice to the complaining party. Davidson, 509 S.W.3d at 193</w:t>
+      <w:r>
+        <w:rPr>
+          <w:b/>
+          <w:bCs/>
+        </w:rPr>
+        <w:t xml:space="preserve"> </w:t>
+      </w:r>
+      <w:r>
+        <w:rPr>
+          <w:b/>
+          <w:bCs/>
+        </w:rPr>
+        <w:t xml:space="preserve">Denying</w:t>
+      </w:r>
+      <w:r>
+        <w:rPr>
+          <w:b/>
+          <w:bCs/>
+        </w:rPr>
+        <w:t xml:space="preserve"> </w:t>
+      </w:r>
+      <w:r>
+        <w:rPr>
+          <w:b/>
+          <w:bCs/>
+        </w:rPr>
+        <w:t xml:space="preserve">Appellants’</w:t>
+      </w:r>
+      <w:r>
+        <w:rPr>
+          <w:b/>
+          <w:bCs/>
+        </w:rPr>
+        <w:t xml:space="preserve"> </w:t>
+      </w:r>
+      <w:r>
+        <w:rPr>
+          <w:b/>
+          <w:bCs/>
+        </w:rPr>
+        <w:t xml:space="preserve">Eleventh-Hour</w:t>
+      </w:r>
+      <w:r>
+        <w:rPr>
+          <w:b/>
+          <w:bCs/>
+        </w:rPr>
+        <w:t xml:space="preserve"> </w:t>
+      </w:r>
+      <w:r>
+        <w:rPr>
+          <w:b/>
+          <w:bCs/>
+        </w:rPr>
+        <w:t xml:space="preserve">Request</w:t>
+      </w:r>
+      <w:r>
+        <w:rPr>
+          <w:b/>
+          <w:bCs/>
+        </w:rPr>
+        <w:t xml:space="preserve"> </w:t>
+      </w:r>
+      <w:r>
+        <w:rPr>
+          <w:b/>
+          <w:bCs/>
+        </w:rPr>
+        <w:t xml:space="preserve">to</w:t>
+      </w:r>
+      <w:r>
+        <w:rPr>
+          <w:b/>
+          <w:bCs/>
+        </w:rPr>
+        <w:t xml:space="preserve"> </w:t>
+      </w:r>
+      <w:r>
+        <w:rPr>
+          <w:b/>
+          <w:bCs/>
+        </w:rPr>
+        <w:t xml:space="preserve">Add</w:t>
+      </w:r>
+      <w:r>
+        <w:rPr>
+          <w:b/>
+          <w:bCs/>
+        </w:rPr>
+        <w:t xml:space="preserve"> </w:t>
+      </w:r>
+      <w:r>
+        <w:rPr>
+          <w:b/>
+          <w:bCs/>
+        </w:rPr>
+        <w:t xml:space="preserve">an</w:t>
+      </w:r>
+      <w:r>
+        <w:rPr>
+          <w:b/>
+          <w:bCs/>
+        </w:rPr>
+        <w:t xml:space="preserve"> </w:t>
+      </w:r>
+      <w:r>
+        <w:rPr>
+          <w:b/>
+          <w:bCs/>
+        </w:rPr>
+        <w:t xml:space="preserve">As-</w:t>
+      </w:r>
+      <w:r>
+        <w:rPr>
+          <w:b/>
+          <w:bCs/>
+        </w:rPr>
+        <w:t xml:space="preserve"> </w:t>
+      </w:r>
+      <w:r>
+        <w:rPr>
+          <w:b/>
+          <w:bCs/>
+        </w:rPr>
+        <w:t xml:space="preserve">Applied</w:t>
+      </w:r>
+      <w:r>
+        <w:rPr>
+          <w:b/>
+          <w:bCs/>
+        </w:rPr>
+        <w:t xml:space="preserve"> </w:t>
+      </w:r>
+      <w:r>
+        <w:rPr>
+          <w:b/>
+          <w:bCs/>
+        </w:rPr>
+        <w:t xml:space="preserve">Challenge</w:t>
+      </w:r>
+      <w:r>
+        <w:rPr>
+          <w:b/>
+          <w:bCs/>
+        </w:rPr>
+        <w:t xml:space="preserve"> </w:t>
+      </w:r>
+      <w:r>
+        <w:rPr>
+          <w:b/>
+          <w:bCs/>
+        </w:rPr>
+        <w:t xml:space="preserve">Regarding</w:t>
+      </w:r>
+      <w:r>
+        <w:rPr>
+          <w:b/>
+          <w:bCs/>
+        </w:rPr>
+        <w:t xml:space="preserve"> </w:t>
+      </w:r>
+      <w:r>
+        <w:rPr>
+          <w:b/>
+          <w:bCs/>
+        </w:rPr>
+        <w:t xml:space="preserve">the</w:t>
+      </w:r>
+      <w:r>
+        <w:rPr>
+          <w:b/>
+          <w:bCs/>
+        </w:rPr>
+        <w:t xml:space="preserve"> </w:t>
+      </w:r>
+      <w:r>
+        <w:rPr>
+          <w:b/>
+          <w:bCs/>
+        </w:rPr>
+        <w:t xml:space="preserve">Credentials</w:t>
+      </w:r>
+      <w:r>
+        <w:rPr>
+          <w:b/>
+          <w:bCs/>
+        </w:rPr>
+        <w:t xml:space="preserve"> </w:t>
+      </w:r>
+      <w:r>
+        <w:rPr>
+          <w:b/>
+          <w:bCs/>
+        </w:rPr>
+        <w:t xml:space="preserve">and</w:t>
+      </w:r>
+      <w:r>
+        <w:rPr>
+          <w:b/>
+          <w:bCs/>
+        </w:rPr>
+        <w:t xml:space="preserve"> </w:t>
+      </w:r>
+      <w:r>
+        <w:rPr>
+          <w:b/>
+          <w:bCs/>
+        </w:rPr>
+        <w:t xml:space="preserve">Qualifications</w:t>
+      </w:r>
+      <w:r>
+        <w:rPr>
+          <w:b/>
+          <w:bCs/>
+        </w:rPr>
+        <w:t xml:space="preserve"> </w:t>
+      </w:r>
+      <w:r>
+        <w:rPr>
+          <w:b/>
+          <w:bCs/>
+        </w:rPr>
+        <w:t xml:space="preserve">of</w:t>
+      </w:r>
+      <w:r>
+        <w:rPr>
+          <w:b/>
+          <w:bCs/>
+        </w:rPr>
+        <w:t xml:space="preserve"> </w:t>
+      </w:r>
+      <w:r>
+        <w:rPr>
+          <w:b/>
+          <w:bCs/>
+        </w:rPr>
+        <w:t xml:space="preserve">the</w:t>
+      </w:r>
+      <w:r>
+        <w:rPr>
+          <w:b/>
+          <w:bCs/>
+        </w:rPr>
+        <w:t xml:space="preserve"> </w:t>
+      </w:r>
+      <w:r>
+        <w:rPr>
+          <w:b/>
+          <w:bCs/>
+        </w:rPr>
+        <w:t xml:space="preserve">State’s</w:t>
+      </w:r>
+      <w:r>
+        <w:rPr>
+          <w:b/>
+          <w:bCs/>
+        </w:rPr>
+        <w:t xml:space="preserve"> </w:t>
+      </w:r>
+      <w:r>
+        <w:rPr>
+          <w:b/>
+          <w:bCs/>
+        </w:rPr>
+        <w:t xml:space="preserve">Source</w:t>
+      </w:r>
+      <w:r>
+        <w:rPr>
+          <w:b/>
+          <w:bCs/>
+        </w:rPr>
+        <w:t xml:space="preserve"> </w:t>
+      </w:r>
+      <w:r>
+        <w:rPr>
+          <w:b/>
+          <w:bCs/>
+        </w:rPr>
+        <w:t xml:space="preserve">of</w:t>
+      </w:r>
+      <w:r>
+        <w:rPr>
+          <w:b/>
+          <w:bCs/>
+        </w:rPr>
+        <w:t xml:space="preserve"> </w:t>
+      </w:r>
+      <w:r>
+        <w:rPr>
+          <w:b/>
+          <w:bCs/>
+        </w:rPr>
+        <w:t xml:space="preserve">Lethal</w:t>
+      </w:r>
+      <w:r>
+        <w:rPr>
+          <w:b/>
+          <w:bCs/>
+        </w:rPr>
+        <w:t xml:space="preserve"> </w:t>
+      </w:r>
+      <w:r>
+        <w:rPr>
+          <w:b/>
+          <w:bCs/>
+        </w:rPr>
+        <w:t xml:space="preserve">Injection</w:t>
+      </w:r>
+    </w:p>
+    <w:p>
+      <w:pPr>
+        <w:pStyle w:val="BodyText"/>
+      </w:pPr>
+      <w:r>
+        <w:t xml:space="preserve">Appellants contend that the Chancery Court abused its discretion in denying their motion to raise an as-applied challenge to the qualifications of the Department’s drug supplier/​compounder. on June 28, 2018, just eleven days before the start of trial. TR X, 1275. A court abuses its discretion only if it applies an incorrect legal standard, reaches a conclusion that is not logical, bases its decision on a clearly erroneous assessment of the evidence, or uses reasoning that causes an injustice to the complaining party. Davidson, 509 S.W.3d at 193</w:t>
       </w:r>
       <w:r>
         <w:noBreakHyphen/>
@@ -5918,15 +6546,7 @@
         <w:pStyle w:val="BodyText"/>
       </w:pPr>
       <w:r>
-        <w:t xml:space="preserve">The decision whether to permit an amendment is discretionary but guided by a number of circumstances that, singly or in combination, could warrant denying a motion to amend a pleading. Hardcastle v. Harris, 170 S.W.3d 67, 80 (Tenn. Ct. App. 2004). These circumstances include: (1) undue delay in seeking the amendment; (2) lack of notice to the opposing party; (3) bad faith or dilatory motive of the moving party; (4) repeated failure by the moving party to cure deficiencies in earlier amendments; (5) futility of the proposed amendment; and (6) undue prejudice to the opposing party. Id. And, as especially applicable here, “[l]ate amendments fundamentally changing the theory of a case are generally not viewed favorably when the facts and theory have been known to the party seeking the amendment since the beginning of the litigation.” Id. at 81.</w:t>
-      </w:r>
-    </w:p>
-    <w:p>
-      <w:pPr>
-        <w:pStyle w:val="BodyText"/>
-      </w:pPr>
-      <w:r>
-        <w:t xml:space="preserve">The Chancery Court considered these factors in denying Appellants’ motion to add as-applied challenges related to the qualifications of the Department’s drug supplier. The motion was denied because of Appellants’ undue delay in moving to amend and because as- applied challenges fundamentally change the nature of the lawsuit. TR X, 1361</w:t>
+        <w:t xml:space="preserve">The decision whether to permit an amendment is discretionary but guided by a number of circumstances that, singly or in combination, could warrant denying a motion to amend a pleading. Hardcastle v. Harris, 170 S.W.3d 67, 80 (Tenn. Ct. App. 2004). These circumstances include: (1) undue delay in seeking the amendment; (2) lack of notice to the opposing party; (3) bad faith or dilatory motive of the moving party; (4) repeated failure by the moving party to cure deficiencies in earlier amendments; (5) futility of the proposed amendment; and (6) undue prejudice to the opposing party. Id. And, as especially applicable here, “[l]ate amendments fundamentally changing the theory of a case are generally not viewed favorably when the facts and theory have been known to the party seeking the amendment since the beginning of the litigation.” Id. at 81. The Chancery Court considered these factors in denying Appellants’ motion to add as-applied challenges related to the qualifications of the Department’s drug supplier. The motion was denied because of Appellants’ undue delay in moving to amend and because as- applied challenges fundamentally change the nature of the lawsuit. TR X, 1361</w:t>
       </w:r>
       <w:r>
         <w:noBreakHyphen/>
@@ -5946,15 +6566,7 @@
         <w:noBreakHyphen/>
       </w:r>
       <w:r>
-        <w:t xml:space="preserve">87. Appellants made no such offer.</w:t>
-      </w:r>
-    </w:p>
-    <w:p>
-      <w:pPr>
-        <w:pStyle w:val="BodyText"/>
-      </w:pPr>
-      <w:r>
-        <w:t xml:space="preserve">In any event, an amendment to add an as-applied challenge to the qualifications of the Department’s drug supplier/​compounder would have been futile. Appellants made no specific allegation as to how implementation of the protocol using compounded lethal injection chemicals would be unconstitutional as applied to any individual inmate. Instead, their contention that one or more participant in the execution process may cause the protocol to be carried out in an unconstitutional manner in the future was hypothetical and speculative and therefore not justiciable under the Declaratory Judgments Act. See West I, 460 S.W.3d at 132.</w:t>
+        <w:t xml:space="preserve">87. Appellants made no such offer. In any event, an amendment to add an as-applied challenge to the qualifications of the Department’s drug supplier/​compounder would have been futile. Appellants made no specific allegation as to how implementation of the protocol using compounded lethal injection chemicals would be unconstitutional as applied to any individual inmate. Instead, their contention that one or more participant in the execution process may cause the protocol to be carried out in an unconstitutional manner in the future was hypothetical and speculative and therefore not justiciable under the Declaratory Judgments Act. See West I, 460 S.W.3d at 132.</w:t>
       </w:r>
     </w:p>
     <w:p>
@@ -6098,13 +6710,145 @@
         </w:rPr>
         <w:t xml:space="preserve">in</w:t>
       </w:r>
-    </w:p>
-    <w:p>
-      <w:pPr>
-        <w:pStyle w:val="BodyText"/>
-      </w:pPr>
-      <w:r>
-        <w:t xml:space="preserve">Permitting Appellees’ Expert Dr. Feng Li to Testify Out of</w:t>
+      <w:r>
+        <w:rPr>
+          <w:b/>
+          <w:bCs/>
+        </w:rPr>
+        <w:t xml:space="preserve"> </w:t>
+      </w:r>
+      <w:r>
+        <w:rPr>
+          <w:b/>
+          <w:bCs/>
+        </w:rPr>
+        <w:t xml:space="preserve">Permitting</w:t>
+      </w:r>
+      <w:r>
+        <w:rPr>
+          <w:b/>
+          <w:bCs/>
+        </w:rPr>
+        <w:t xml:space="preserve"> </w:t>
+      </w:r>
+      <w:r>
+        <w:rPr>
+          <w:b/>
+          <w:bCs/>
+        </w:rPr>
+        <w:t xml:space="preserve">Appellees’</w:t>
+      </w:r>
+      <w:r>
+        <w:rPr>
+          <w:b/>
+          <w:bCs/>
+        </w:rPr>
+        <w:t xml:space="preserve"> </w:t>
+      </w:r>
+      <w:r>
+        <w:rPr>
+          <w:b/>
+          <w:bCs/>
+        </w:rPr>
+        <w:t xml:space="preserve">Expert</w:t>
+      </w:r>
+      <w:r>
+        <w:rPr>
+          <w:b/>
+          <w:bCs/>
+        </w:rPr>
+        <w:t xml:space="preserve"> </w:t>
+      </w:r>
+      <w:r>
+        <w:rPr>
+          <w:b/>
+          <w:bCs/>
+        </w:rPr>
+        <w:t xml:space="preserve">Dr.</w:t>
+      </w:r>
+      <w:r>
+        <w:rPr>
+          <w:b/>
+          <w:bCs/>
+        </w:rPr>
+        <w:t xml:space="preserve"> </w:t>
+      </w:r>
+      <w:r>
+        <w:rPr>
+          <w:b/>
+          <w:bCs/>
+        </w:rPr>
+        <w:t xml:space="preserve">Feng</w:t>
+      </w:r>
+      <w:r>
+        <w:rPr>
+          <w:b/>
+          <w:bCs/>
+        </w:rPr>
+        <w:t xml:space="preserve"> </w:t>
+      </w:r>
+      <w:r>
+        <w:rPr>
+          <w:b/>
+          <w:bCs/>
+        </w:rPr>
+        <w:t xml:space="preserve">Li</w:t>
+      </w:r>
+      <w:r>
+        <w:rPr>
+          <w:b/>
+          <w:bCs/>
+        </w:rPr>
+        <w:t xml:space="preserve"> </w:t>
+      </w:r>
+      <w:r>
+        <w:rPr>
+          <w:b/>
+          <w:bCs/>
+        </w:rPr>
+        <w:t xml:space="preserve">to</w:t>
+      </w:r>
+      <w:r>
+        <w:rPr>
+          <w:b/>
+          <w:bCs/>
+        </w:rPr>
+        <w:t xml:space="preserve"> </w:t>
+      </w:r>
+      <w:r>
+        <w:rPr>
+          <w:b/>
+          <w:bCs/>
+        </w:rPr>
+        <w:t xml:space="preserve">Testify</w:t>
+      </w:r>
+      <w:r>
+        <w:rPr>
+          <w:b/>
+          <w:bCs/>
+        </w:rPr>
+        <w:t xml:space="preserve"> </w:t>
+      </w:r>
+      <w:r>
+        <w:rPr>
+          <w:b/>
+          <w:bCs/>
+        </w:rPr>
+        <w:t xml:space="preserve">Out</w:t>
+      </w:r>
+      <w:r>
+        <w:rPr>
+          <w:b/>
+          <w:bCs/>
+        </w:rPr>
+        <w:t xml:space="preserve"> </w:t>
+      </w:r>
+      <w:r>
+        <w:rPr>
+          <w:b/>
+          <w:bCs/>
+        </w:rPr>
+        <w:t xml:space="preserve">of</w:t>
       </w:r>
     </w:p>
     <w:p>
@@ -6132,15 +6876,7 @@
         <w:noBreakHyphen/>
       </w:r>
       <w:r>
-        <w:t xml:space="preserve">28 (Tenn. Crim. App. 1971); Wilson v. State, 452 S.W.2d 355, 358 (Tenn. Crim. App. 1969); Castelli v. Lien, 910 S.W.2d 420, 425 (Tenn. Ct. App. 1995) (trial judges have broad discretion over the order of proof). Appellate courts will reverse a judge’s decision only</w:t>
-      </w:r>
-    </w:p>
-    <w:p>
-      <w:pPr>
-        <w:pStyle w:val="BodyText"/>
-      </w:pPr>
-      <w:r>
-        <w:t xml:space="preserve">if the trial judge abused her discretion and when the error has affected substantial rights of one or both parties. Castelli, 910 S.W.2d at 425</w:t>
+        <w:t xml:space="preserve">28 (Tenn. Crim. App. 1971); Wilson v. State, 452 S.W.2d 355, 358 (Tenn. Crim. App. 1969); Castelli v. Lien, 910 S.W.2d 420, 425 (Tenn. Ct. App. 1995) (trial judges have broad discretion over the order of proof). Appellate courts will reverse a judge’s decision only if the trial judge abused her discretion and when the error has affected substantial rights of one or both parties. Castelli, 910 S.W.2d at 425</w:t>
       </w:r>
       <w:r>
         <w:noBreakHyphen/>
@@ -6162,15 +6898,7 @@
         <w:pStyle w:val="BodyText"/>
       </w:pPr>
       <w:r>
-        <w:t xml:space="preserve">This issue is entirely meritless.</w:t>
-      </w:r>
-    </w:p>
-    <w:p>
-      <w:pPr>
-        <w:pStyle w:val="BodyText"/>
-      </w:pPr>
-      <w:r>
-        <w:t xml:space="preserve">XII. The Chancery Court Did Not Abuse Its Discretion in</w:t>
+        <w:t xml:space="preserve">This issue is entirely meritless. XII. The Chancery Court Did Not Abuse Its Discretion in</w:t>
       </w:r>
     </w:p>
     <w:p>
@@ -6194,15 +6922,7 @@
         <w:pStyle w:val="BodyText"/>
       </w:pPr>
       <w:r>
-        <w:t xml:space="preserve">A “witness qualified as an expert by knowledge, skill, experience, training or education may testify in the form of an opinion or otherwise” if that testimony “will substantially assist the trier of fact to understand the evidence or to determine a fact in issue.” Tenn. R. Evid. 702 . A court “shall disallow testimony in the form of an opinion or inference if the underlying facts or date indicate a lack of trustworthiness.” Tenn. R. Evid. 703. Questions regarding the admissibility of expert testimony rest</w:t>
-      </w:r>
-    </w:p>
-    <w:p>
-      <w:pPr>
-        <w:pStyle w:val="BodyText"/>
-      </w:pPr>
-      <w:r>
-        <w:t xml:space="preserve">within the sound discretion of the trial court, and a court’s ruling will only be overturned if the discretion is “arbitrarily exercised or abused.” McDaniel, 955 S.W.2d at 263</w:t>
+        <w:t xml:space="preserve">A “witness qualified as an expert by knowledge, skill, experience, training or education may testify in the form of an opinion or otherwise” if that testimony “will substantially assist the trier of fact to understand the evidence or to determine a fact in issue.” Tenn. R. Evid. 702 . A court “shall disallow testimony in the form of an opinion or inference if the underlying facts or date indicate a lack of trustworthiness.” Tenn. R. Evid. 703. Questions regarding the admissibility of expert testimony rest within the sound discretion of the trial court, and a court’s ruling will only be overturned if the discretion is “arbitrarily exercised or abused.” McDaniel, 955 S.W.2d at 263</w:t>
       </w:r>
       <w:r>
         <w:noBreakHyphen/>
@@ -6252,31 +6972,15 @@
         <w:pStyle w:val="BodyText"/>
       </w:pPr>
       <w:r>
-        <w:t xml:space="preserve">In the final analysis, however, any error in the admission of the testimony of Appellees’ experts is harmless because the testimony of Dr. Evans and Dr. Li had absolutely no bearing on the sole issue on which</w:t>
-      </w:r>
-    </w:p>
-    <w:p>
-      <w:pPr>
-        <w:pStyle w:val="BodyText"/>
-      </w:pPr>
-      <w:r>
-        <w:t xml:space="preserve">the Chancery Court based its decision. That decision turned solely on Appellants’ failure to satisfy the feasible-alternative element of Glossip: “The Court finds that in this lawsuit, the Plaintiffs have failed to prove the essential element that there exists an available alternative. On this basis alone, by United States law, this lawsuit must be dismissed.” XVI, 2239 (emphasis added).</w:t>
-      </w:r>
-    </w:p>
-    <w:p>
-      <w:pPr>
-        <w:pStyle w:val="BodyText"/>
-      </w:pPr>
-      <w:r>
-        <w:t xml:space="preserve">Appellants are entitled to no relief in this issue.</w:t>
-      </w:r>
-    </w:p>
-    <w:p>
-      <w:pPr>
-        <w:pStyle w:val="BodyText"/>
-      </w:pPr>
-      <w:r>
-        <w:t xml:space="preserve">XIII. This Court’s Expedited Appellate Schedule Does Not Violate</w:t>
+        <w:t xml:space="preserve">In the final analysis, however, any error in the admission of the testimony of Appellees’ experts is harmless because the testimony of Dr. Evans and Dr. Li had absolutely no bearing on the sole issue on which the Chancery Court based its decision. That decision turned solely on Appellants’ failure to satisfy the feasible-alternative element of Glossip: “The Court finds that in this lawsuit, the Plaintiffs have failed to prove the essential element that there exists an available alternative. On this basis alone, by United States law, this lawsuit must be dismissed.” XVI, 2239 (emphasis added).</w:t>
+      </w:r>
+    </w:p>
+    <w:p>
+      <w:pPr>
+        <w:pStyle w:val="BodyText"/>
+      </w:pPr>
+      <w:r>
+        <w:t xml:space="preserve">Appellants are entitled to no relief in this issue. XIII. This Court’s Expedited Appellate Schedule Does Not Violate</w:t>
       </w:r>
     </w:p>
     <w:p>
@@ -6292,15 +6996,7 @@
         <w:pStyle w:val="BodyText"/>
       </w:pPr>
       <w:r>
-        <w:t xml:space="preserve">The fundamental element of due process is “the opportunity to be heard ‘at a meaningful time and in a meaningful manner.’” Matthews v. Eldridge, 424 U.S. 319, 333 (1976) (quoting Armstrong v. Manzo, 380 U.S. 545, 552 (1965)). But due process is flexible and requires consideration of the panoply of interests involved. Workman v. State, 41 S.W.3d 100, 103 (Tenn. 2001). “The opportunity to present reasons, either in person or in writing, why proposed action should not be taken is a fundamental due process requirement.” Moncier v. Board of Professional Responsibility, 406 S.W.3d 139, 153 (Tenn. 2013) (quoting Cleveland Bd. Of Educ. v. Loudermill, 470 U.S. 532, 546 (1985)). The hearing must also employ a decision-maker or decision-makers who are unbiased. Heyne v.</w:t>
-      </w:r>
-    </w:p>
-    <w:p>
-      <w:pPr>
-        <w:pStyle w:val="BodyText"/>
-      </w:pPr>
-      <w:r>
-        <w:t xml:space="preserve">Metropolitan Nashville Bd. of Educ., 380 S.W.3d 715, 734</w:t>
+        <w:t xml:space="preserve">The fundamental element of due process is “the opportunity to be heard ‘at a meaningful time and in a meaningful manner.’” Matthews v. Eldridge, 424 U.S. 319, 333 (1976) (quoting Armstrong v. Manzo, 380 U.S. 545, 552 (1965)). But due process is flexible and requires consideration of the panoply of interests involved. Workman v. State, 41 S.W.3d 100, 103 (Tenn. 2001). “The opportunity to present reasons, either in person or in writing, why proposed action should not be taken is a fundamental due process requirement.” Moncier v. Board of Professional Responsibility, 406 S.W.3d 139, 153 (Tenn. 2013) (quoting Cleveland Bd. Of Educ. v. Loudermill, 470 U.S. 532, 546 (1985)). The hearing must also employ a decision-maker or decision-makers who are unbiased. Heyne v. Metropolitan Nashville Bd. of Educ., 380 S.W.3d 715, 734</w:t>
       </w:r>
       <w:r>
         <w:noBreakHyphen/>
@@ -6322,23 +7018,7 @@
         <w:pStyle w:val="BodyText"/>
       </w:pPr>
       <w:r>
-        <w:t xml:space="preserve">Moreover, the “promise” of Gregg v. Georgia, 428 U.S. 153 (1976), has already been fulfilled. Gregg made clear that a death penalty may be constitutionally imposed through a system in which the sentencing authority is apprised of the information relevant to the imposition of the sentence and provided with standards to guide its use of the information. 428 U.S. at 195. Each of the Appellants was charged by the State of Tennessee with first-degree murder. They were afforded counsel and tried twice by a jury, first to determine whether they were guilty of the crime and again to determine whether death was the appropriate sentence based on an individualized assessment of aggravating and mitigating circumstances. They were convicted and sentenced according to law and were afforded the right to direct and post-conviction review in the state and federal courts. The method of execution to be employed by the State of Tennessee to carry out Appellants’ lawful sentences has been upheld by the United States Supreme Court and numerous other courts.</w:t>
-      </w:r>
-    </w:p>
-    <w:p>
-      <w:pPr>
-        <w:pStyle w:val="BodyText"/>
-      </w:pPr>
-      <w:r>
-        <w:t xml:space="preserve">It has never been held unconstitutional. There is nothing arbitrary or “freakish” about this course of events, and Appellants’ due process claim is meritless.</w:t>
-      </w:r>
-    </w:p>
-    <w:p>
-      <w:pPr>
-        <w:pStyle w:val="BodyText"/>
-      </w:pPr>
-      <w:r>
-        <w:t xml:space="preserve">Additional Issues Raised by Miller Appellants:</w:t>
+        <w:t xml:space="preserve">Moreover, the “promise” of Gregg v. Georgia, 428 U.S. 153 (1976), has already been fulfilled. Gregg made clear that a death penalty may be constitutionally imposed through a system in which the sentencing authority is apprised of the information relevant to the imposition of the sentence and provided with standards to guide its use of the information. 428 U.S. at 195. Each of the Appellants was charged by the State of Tennessee with first-degree murder. They were afforded counsel and tried twice by a jury, first to determine whether they were guilty of the crime and again to determine whether death was the appropriate sentence based on an individualized assessment of aggravating and mitigating circumstances. They were convicted and sentenced according to law and were afforded the right to direct and post-conviction review in the state and federal courts. The method of execution to be employed by the State of Tennessee to carry out Appellants’ lawful sentences has been upheld by the United States Supreme Court and numerous other courts. It has never been held unconstitutional. There is nothing arbitrary or “freakish” about this course of events, and Appellants’ due process claim is meritless. Additional Issues Raised by Miller Appellants:</w:t>
       </w:r>
     </w:p>
     <w:p>
@@ -6482,29 +7162,69 @@
         </w:rPr>
         <w:t xml:space="preserve">Facts</w:t>
       </w:r>
-    </w:p>
-    <w:p>
-      <w:pPr>
-        <w:pStyle w:val="BodyText"/>
-      </w:pPr>
-      <w:r>
-        <w:t xml:space="preserve">Developed in Other Cases.</w:t>
-      </w:r>
-    </w:p>
-    <w:p>
-      <w:pPr>
-        <w:pStyle w:val="BodyText"/>
-      </w:pPr>
-      <w:r>
-        <w:t xml:space="preserve">The Miller Appellants first contend that the Chancery Court violated their right to due process of law by “relying on fact-based findings from other cases” in addressing the first element of Glossip. Miller Brief, at 23. This contention is meritless for two reasons. First, the premise is demonstrably wrong: a plain reading of the Chancery Court’s decision shows that it does not rely on fact findings from other cases. Second, the “fact-based findings from other cases” to which the Miller Appellants refer all go to the question of the risk of injury posed by midazolam. But the Chancery Court’s ruling rests entirely on its determination that Appellants failed to show that their proposed alternative method of execution—pentobarbital—is available to the State of Tennessee. “On this basis alone, by United States law, this lawsuit is dismissed.” XVI, 2239. Because the Eighth Amendment “requires a prisoner to plead and prove and known and available alternative,” Glossip, 135 S.Ct. at 2739, and because Appellants failed to do this, which</w:t>
-      </w:r>
-    </w:p>
-    <w:p>
-      <w:pPr>
-        <w:pStyle w:val="BodyText"/>
-      </w:pPr>
-      <w:r>
-        <w:t xml:space="preserve">failure alone resulted in dismissal of their suit, any fact issues related to the alleged risks of injury from midazolam are not dispositive.7</w:t>
+      <w:r>
+        <w:rPr>
+          <w:b/>
+          <w:bCs/>
+        </w:rPr>
+        <w:t xml:space="preserve"> </w:t>
+      </w:r>
+      <w:r>
+        <w:rPr>
+          <w:b/>
+          <w:bCs/>
+        </w:rPr>
+        <w:t xml:space="preserve">Developed</w:t>
+      </w:r>
+      <w:r>
+        <w:rPr>
+          <w:b/>
+          <w:bCs/>
+        </w:rPr>
+        <w:t xml:space="preserve"> </w:t>
+      </w:r>
+      <w:r>
+        <w:rPr>
+          <w:b/>
+          <w:bCs/>
+        </w:rPr>
+        <w:t xml:space="preserve">in</w:t>
+      </w:r>
+      <w:r>
+        <w:rPr>
+          <w:b/>
+          <w:bCs/>
+        </w:rPr>
+        <w:t xml:space="preserve"> </w:t>
+      </w:r>
+      <w:r>
+        <w:rPr>
+          <w:b/>
+          <w:bCs/>
+        </w:rPr>
+        <w:t xml:space="preserve">Other</w:t>
+      </w:r>
+      <w:r>
+        <w:rPr>
+          <w:b/>
+          <w:bCs/>
+        </w:rPr>
+        <w:t xml:space="preserve"> </w:t>
+      </w:r>
+      <w:r>
+        <w:rPr>
+          <w:b/>
+          <w:bCs/>
+        </w:rPr>
+        <w:t xml:space="preserve">Cases.</w:t>
+      </w:r>
+    </w:p>
+    <w:p>
+      <w:pPr>
+        <w:pStyle w:val="BodyText"/>
+      </w:pPr>
+      <w:r>
+        <w:t xml:space="preserve">The Miller Appellants first contend that the Chancery Court violated their right to due process of law by “relying on fact-based findings from other cases” in addressing the first element of Glossip. Miller Brief, at 23. This contention is meritless for two reasons. First, the premise is demonstrably wrong: a plain reading of the Chancery Court’s decision shows that it does not rely on fact findings from other cases. Second, the “fact-based findings from other cases” to which the Miller Appellants refer all go to the question of the risk of injury posed by midazolam. But the Chancery Court’s ruling rests entirely on its determination that Appellants failed to show that their proposed alternative method of execution—pentobarbital—is available to the State of Tennessee. “On this basis alone, by United States law, this lawsuit is dismissed.” XVI, 2239. Because the Eighth Amendment “requires a prisoner to plead and prove and known and available alternative,” Glossip, 135 S.Ct. at 2739, and because Appellants failed to do this, which failure alone resulted in dismissal of their suit, any fact issues related to the alleged risks of injury from midazolam are not dispositive.7</w:t>
       </w:r>
     </w:p>
     <w:p>
@@ -6526,23 +7246,7 @@
         <w:noBreakHyphen/>
       </w:r>
       <w:r>
-        <w:t xml:space="preserve">58. These considerations properly informed the</w:t>
-      </w:r>
-    </w:p>
-    <w:p>
-      <w:pPr>
-        <w:pStyle w:val="BodyText"/>
-      </w:pPr>
-      <w:r>
-        <w:t xml:space="preserve">7Appellants’ suggestion that the Chancery Court must address the elements in any particular order is meritless. Miller Brief, at 23. Glossip makes clear that an inmate’s failure to prove either of the two elements is an “independent reason[]” for dismissal of the claim. 135 S.Ct. at 2731.</w:t>
-      </w:r>
-    </w:p>
-    <w:p>
-      <w:pPr>
-        <w:pStyle w:val="BodyText"/>
-      </w:pPr>
-      <w:r>
-        <w:t xml:space="preserve">Court’s legal conclusion that the risk of harm from the use of a midazolam-based lethal injection protocol is not “sure or very likely to result in needless suffering.” Glossip, 135 S.Ct. at 2739.</w:t>
+        <w:t xml:space="preserve">58. These considerations properly informed the 7Appellants’ suggestion that the Chancery Court must address the elements in any particular order is meritless. Miller Brief, at 23. Glossip makes clear that an inmate’s failure to prove either of the two elements is an “independent reason[]” for dismissal of the claim. 135 S.Ct. at 2731. Court’s legal conclusion that the risk of harm from the use of a midazolam-based lethal injection protocol is not “sure or very likely to result in needless suffering.” Glossip, 135 S.Ct. at 2739.</w:t>
       </w:r>
     </w:p>
     <w:p>
@@ -6566,15 +7270,7 @@
         <w:pStyle w:val="BodyText"/>
       </w:pPr>
       <w:r>
-        <w:t xml:space="preserve">The Chancery Court’s review and application of other cases addressing materially similar facts was entirely appropriate and</w:t>
-      </w:r>
-    </w:p>
-    <w:p>
-      <w:pPr>
-        <w:pStyle w:val="BodyText"/>
-      </w:pPr>
-      <w:r>
-        <w:t xml:space="preserve">provides no basis for relief.8 It in no way impinged on any right to due process.</w:t>
+        <w:t xml:space="preserve">The Chancery Court’s review and application of other cases addressing materially similar facts was entirely appropriate and provides no basis for relief.8 It in no way impinged on any right to due process.</w:t>
       </w:r>
     </w:p>
     <w:p>
@@ -6732,13 +7428,75 @@
         </w:rPr>
         <w:t xml:space="preserve">on</w:t>
       </w:r>
-    </w:p>
-    <w:p>
-      <w:pPr>
-        <w:pStyle w:val="BodyText"/>
-      </w:pPr>
-      <w:r>
-        <w:t xml:space="preserve">the Second Element of Glossip.</w:t>
+      <w:r>
+        <w:rPr>
+          <w:b/>
+          <w:bCs/>
+        </w:rPr>
+        <w:t xml:space="preserve"> </w:t>
+      </w:r>
+      <w:r>
+        <w:rPr>
+          <w:b/>
+          <w:bCs/>
+        </w:rPr>
+        <w:t xml:space="preserve">the</w:t>
+      </w:r>
+      <w:r>
+        <w:rPr>
+          <w:b/>
+          <w:bCs/>
+        </w:rPr>
+        <w:t xml:space="preserve"> </w:t>
+      </w:r>
+      <w:r>
+        <w:rPr>
+          <w:b/>
+          <w:bCs/>
+        </w:rPr>
+        <w:t xml:space="preserve">Second</w:t>
+      </w:r>
+      <w:r>
+        <w:rPr>
+          <w:b/>
+          <w:bCs/>
+        </w:rPr>
+        <w:t xml:space="preserve"> </w:t>
+      </w:r>
+      <w:r>
+        <w:rPr>
+          <w:b/>
+          <w:bCs/>
+        </w:rPr>
+        <w:t xml:space="preserve">Element</w:t>
+      </w:r>
+      <w:r>
+        <w:rPr>
+          <w:b/>
+          <w:bCs/>
+        </w:rPr>
+        <w:t xml:space="preserve"> </w:t>
+      </w:r>
+      <w:r>
+        <w:rPr>
+          <w:b/>
+          <w:bCs/>
+        </w:rPr>
+        <w:t xml:space="preserve">of</w:t>
+      </w:r>
+      <w:r>
+        <w:rPr>
+          <w:b/>
+          <w:bCs/>
+        </w:rPr>
+        <w:t xml:space="preserve"> </w:t>
+      </w:r>
+      <w:r>
+        <w:rPr>
+          <w:b/>
+          <w:bCs/>
+        </w:rPr>
+        <w:t xml:space="preserve">Glossip.</w:t>
       </w:r>
     </w:p>
     <w:p>
@@ -6768,11 +7526,9 @@
         </w:rPr>
         <w:footnoteReference w:id="14"/>
       </w:r>
-    </w:p>
-    <w:p>
-      <w:pPr>
-        <w:pStyle w:val="BodyText"/>
-      </w:pPr>
+      <w:r>
+        <w:t xml:space="preserve"> </w:t>
+      </w:r>
       <w:r>
         <w:t xml:space="preserve">But this theory does not comport with reality. Appellants had actual notice that pentobarbital was unavailable to the State as early as February 15, 2018, before the commencement of this action and well before their various amended complaints were filed. Appellants were on notice—through at least one filing made by the State in this Court and served on counsel for all the Appellants—that pentobarbital was very likely not available to the Department for the purposes of carrying out executions. State’s Motion to Set Execution Dates, filed on February 15, 2018. The Motion, at 1, makes clear that the Department anticipated “difficulty obtaining the drugs necessary to carry out execution by lethal injection” after June 1, 2018. With specific reference to pentobarbital, the Motion expressly states, at 2 (emphasis added):</w:t>
       </w:r>
@@ -6782,119 +7538,39 @@
         <w:pStyle w:val="BodyText"/>
       </w:pPr>
       <w:r>
-        <w:t xml:space="preserve">Despite continuing efforts to identify an alternate source of</w:t>
-      </w:r>
-    </w:p>
-    <w:p>
-      <w:pPr>
-        <w:pStyle w:val="BodyText"/>
-      </w:pPr>
-      <w:r>
-        <w:t xml:space="preserve">pentobarbital, the Department currently has none on hand</w:t>
-      </w:r>
-    </w:p>
-    <w:p>
-      <w:pPr>
-        <w:pStyle w:val="BodyText"/>
-      </w:pPr>
-      <w:r>
-        <w:t xml:space="preserve">and no known source to obtain more. As a result, the</w:t>
-      </w:r>
-    </w:p>
-    <w:p>
-      <w:pPr>
-        <w:pStyle w:val="BodyText"/>
-      </w:pPr>
-      <w:r>
-        <w:t xml:space="preserve">Department deemed it necessary to provide an alternative</w:t>
-      </w:r>
-    </w:p>
-    <w:p>
-      <w:pPr>
-        <w:pStyle w:val="BodyText"/>
-      </w:pPr>
-      <w:r>
-        <w:t xml:space="preserve">drug combination to ensure it could comply with its statutory</w:t>
-      </w:r>
-    </w:p>
-    <w:p>
-      <w:pPr>
-        <w:pStyle w:val="BodyText"/>
-      </w:pPr>
-      <w:r>
-        <w:t xml:space="preserve">obligation to carry out death sentences by lethal injection</w:t>
-      </w:r>
-    </w:p>
-    <w:p>
-      <w:pPr>
-        <w:pStyle w:val="BodyText"/>
-      </w:pPr>
-      <w:r>
-        <w:t xml:space="preserve">when ordered to do so. Thus, on January 8, 2018, the</w:t>
-      </w:r>
-    </w:p>
-    <w:p>
-      <w:pPr>
-        <w:pStyle w:val="BodyText"/>
-      </w:pPr>
-      <w:r>
-        <w:t xml:space="preserve">Commissioner of Correction approved a revised lethal</w:t>
-      </w:r>
-    </w:p>
-    <w:p>
-      <w:pPr>
-        <w:pStyle w:val="BodyText"/>
-      </w:pPr>
-      <w:r>
-        <w:t xml:space="preserve">injection protocol, which added an alternative protocol</w:t>
-      </w:r>
-    </w:p>
-    <w:p>
-      <w:pPr>
-        <w:pStyle w:val="BodyText"/>
-      </w:pPr>
-      <w:r>
-        <w:t xml:space="preserve">(Protocol B) using a three-drug combination, consisting of</w:t>
-      </w:r>
-    </w:p>
-    <w:p>
-      <w:pPr>
-        <w:pStyle w:val="BodyText"/>
-      </w:pPr>
-      <w:r>
-        <w:t xml:space="preserve">midazolam, vecuronium bromide, and potassium chloride,</w:t>
-      </w:r>
-    </w:p>
-    <w:p>
-      <w:pPr>
-        <w:pStyle w:val="BodyText"/>
-      </w:pPr>
-      <w:r>
-        <w:t xml:space="preserve">along with the existing single-drug protocol using</w:t>
-      </w:r>
-    </w:p>
-    <w:p>
-      <w:pPr>
-        <w:pStyle w:val="BodyText"/>
-      </w:pPr>
-      <w:r>
-        <w:t xml:space="preserve">pentobarbital (Protocol A).</w:t>
-      </w:r>
-    </w:p>
-    <w:p>
-      <w:pPr>
-        <w:pStyle w:val="BodyText"/>
-      </w:pPr>
-      <w:r>
-        <w:t xml:space="preserve">Clearly, if the Appellants drew an incorrect inference about the availability of pentobarbital from the Department’s retention of Protocol A in its January revision, that is a problem entirely of their own making. If nothing else, the Motion told them explicitly that Protocol B had been</w:t>
-      </w:r>
-    </w:p>
-    <w:p>
-      <w:pPr>
-        <w:pStyle w:val="BodyText"/>
-      </w:pPr>
-      <w:r>
-        <w:t xml:space="preserve">added as an alternative for the very reason that pentobarbital was then unavailable to the Department and would likely be unavailable in the future.</w:t>
+        <w:t xml:space="preserve">Despite continuing efforts to identify an alternate source of pentobarbital, the Department currently has none on hand and no known source to obtain more. As a result, the</w:t>
+      </w:r>
+    </w:p>
+    <w:p>
+      <w:pPr>
+        <w:pStyle w:val="BodyText"/>
+      </w:pPr>
+      <w:r>
+        <w:t xml:space="preserve">Department deemed it necessary to provide an alternative drug combination to ensure it could comply with its statutory obligation to carry out death sentences by lethal injection when ordered to do so. Thus, on January 8, 2018, the</w:t>
+      </w:r>
+    </w:p>
+    <w:p>
+      <w:pPr>
+        <w:pStyle w:val="BodyText"/>
+      </w:pPr>
+      <w:r>
+        <w:t xml:space="preserve">Commissioner of Correction approved a revised lethal injection protocol, which added an alternative protocol</w:t>
+      </w:r>
+    </w:p>
+    <w:p>
+      <w:pPr>
+        <w:pStyle w:val="BodyText"/>
+      </w:pPr>
+      <w:r>
+        <w:t xml:space="preserve">(Protocol B) using a three-drug combination, consisting of midazolam, vecuronium bromide, and potassium chloride, along with the existing single-drug protocol using pentobarbital (Protocol A).</w:t>
+      </w:r>
+    </w:p>
+    <w:p>
+      <w:pPr>
+        <w:pStyle w:val="BodyText"/>
+      </w:pPr>
+      <w:r>
+        <w:t xml:space="preserve">Clearly, if the Appellants drew an incorrect inference about the availability of pentobarbital from the Department’s retention of Protocol A in its January revision, that is a problem entirely of their own making. If nothing else, the Motion told them explicitly that Protocol B had been added as an alternative for the very reason that pentobarbital was then unavailable to the Department and would likely be unavailable in the future.</w:t>
       </w:r>
     </w:p>
     <w:p>
@@ -6932,15 +7608,7 @@
         <w:pStyle w:val="BodyText"/>
       </w:pPr>
       <w:r>
-        <w:t xml:space="preserve">Moreover, the removal of Protocol A is irrelevant to whether there is feasible or readily implemented alternative to Protocol B for purposes</w:t>
-      </w:r>
-    </w:p>
-    <w:p>
-      <w:pPr>
-        <w:pStyle w:val="BodyText"/>
-      </w:pPr>
-      <w:r>
-        <w:t xml:space="preserve">of Glossip. Nothing limited Appellants to identifying as a feasible alternative only a drug or drugs that the Department had specified. The inmate bears the burden of showing that “there is now a source for pentobarbital that would sell it to the [Department of Correction] for use in executions.” Id. at 1302 (emphasis in original). Arthur v. Commissioner, Alabama Department of Corrections, 840 F.3d 1268, 1300 (11th Cir. 2016), cert. denied sub nom., Arthur v. Dunn, 137 S.Ct. 725 (2017). And Appellants had ample notice of the requirement to plead and prove an available alternative through Glossip. This is “a requirement of all Eighth Amendment method-of-execution claims.” Glossip, 135 S.Ct. at 2731 (emphasis added).</w:t>
+        <w:t xml:space="preserve">Moreover, the removal of Protocol A is irrelevant to whether there is feasible or readily implemented alternative to Protocol B for purposes of Glossip. Nothing limited Appellants to identifying as a feasible alternative only a drug or drugs that the Department had specified. The inmate bears the burden of showing that “there is now a source for pentobarbital that would sell it to the [Department of Correction] for use in executions.” Id. at 1302 (emphasis in original). Arthur v. Commissioner, Alabama Department of Corrections, 840 F.3d 1268, 1300 (11th Cir. 2016), cert. denied sub nom., Arthur v. Dunn, 137 S.Ct. 725 (2017). And Appellants had ample notice of the requirement to plead and prove an available alternative through Glossip. This is “a requirement of all Eighth Amendment method-of-execution claims.” Glossip, 135 S.Ct. at 2731 (emphasis added).</w:t>
       </w:r>
     </w:p>
     <w:p>
@@ -6976,11 +7644,9 @@
         </w:rPr>
         <w:footnoteReference w:id="15"/>
       </w:r>
-    </w:p>
-    <w:p>
-      <w:pPr>
-        <w:pStyle w:val="BodyText"/>
-      </w:pPr>
+      <w:r>
+        <w:t xml:space="preserve"> </w:t>
+      </w:r>
       <w:r>
         <w:t xml:space="preserve">From that decision, the inmate petitioned the United States Supreme Court for a writ of certiorari on three questions. Two of the questions address evidentiary standards for comparing a state’s existing method of execution with an inmate’s proposed alternative. The third question asks whether the Eighth Amendment requires an inmate to prove an alternative method of execution at all “when raising an as- applied challenge to the state’s proposed method of execution based on [the inmate’s] rare and severe medical condition.” Petition for Writ of Certiorari at (i), Bucklew v. Precythe, No. 17</w:t>
       </w:r>
@@ -7012,15 +7678,7 @@
         <w:pStyle w:val="BodyText"/>
       </w:pPr>
       <w:r>
-        <w:t xml:space="preserve">Second, Glossip holds that “identify[ing] a known and available alternative method of execution that entails a lesser risk of pain [is] a requirement of all Eighth Amendment method-of-execution claims.”</w:t>
-      </w:r>
-    </w:p>
-    <w:p>
-      <w:pPr>
-        <w:pStyle w:val="BodyText"/>
-      </w:pPr>
-      <w:r>
-        <w:t xml:space="preserve">Glossip, 135 S.Ct. at 2731 (emphasis added). Given this unambiguous authority, Bucklew is not instructive on the Appellants’ burden to plead and prove an alternative method of execution in this case. Glossip and West state that requirement clearly, a requirement that will not be revisited in Bucklew. Indeed, the Supreme Court’s independent, additional question in Bucklew reinforces that requirement. The very premise of the additional question is that the petitioner’s “burden under Glossip” remains a threshold inquiry. Bucklew, 138 S.Ct. at 1706.</w:t>
+        <w:t xml:space="preserve">Second, Glossip holds that “identify[ing] a known and available alternative method of execution that entails a lesser risk of pain [is] a requirement of all Eighth Amendment method-of-execution claims.” Glossip, 135 S.Ct. at 2731 (emphasis added). Given this unambiguous authority, Bucklew is not instructive on the Appellants’ burden to plead and prove an alternative method of execution in this case. Glossip and West state that requirement clearly, a requirement that will not be revisited in Bucklew. Indeed, the Supreme Court’s independent, additional question in Bucklew reinforces that requirement. The very premise of the additional question is that the petitioner’s “burden under Glossip” remains a threshold inquiry. Bucklew, 138 S.Ct. at 1706.</w:t>
       </w:r>
     </w:p>
     <w:p>

</xml_diff>